<commit_message>
Better specify which units I'm using.
</commit_message>
<xml_diff>
--- a/math/projection.docx
+++ b/math/projection.docx
@@ -2,6 +2,32 @@
 <file path=word/document.xml><?xml version="1.0" encoding="utf-8"?>
 <w:document xmlns:wpc="http://schemas.microsoft.com/office/word/2010/wordprocessingCanvas" xmlns:cx="http://schemas.microsoft.com/office/drawing/2014/chartex" xmlns:cx1="http://schemas.microsoft.com/office/drawing/2015/9/8/chartex" xmlns:cx2="http://schemas.microsoft.com/office/drawing/2015/10/21/chartex" xmlns:cx3="http://schemas.microsoft.com/office/drawing/2016/5/9/chartex" xmlns:cx4="http://schemas.microsoft.com/office/drawing/2016/5/10/chartex" xmlns:cx5="http://schemas.microsoft.com/office/drawing/2016/5/11/chartex" xmlns:cx6="http://schemas.microsoft.com/office/drawing/2016/5/12/chartex" xmlns:cx7="http://schemas.microsoft.com/office/drawing/2016/5/13/chartex" xmlns:cx8="http://schemas.microsoft.com/office/drawing/2016/5/14/chartex" xmlns:mc="http://schemas.openxmlformats.org/markup-compatibility/2006" xmlns:aink="http://schemas.microsoft.com/office/drawing/2016/ink" xmlns:am3d="http://schemas.microsoft.com/office/drawing/2017/model3d" xmlns:o="urn:schemas-microsoft-com:office:office" xmlns:oel="http://schemas.microsoft.com/office/2019/extlst" xmlns:r="http://schemas.openxmlformats.org/officeDocument/2006/relationships" xmlns:m="http://schemas.openxmlformats.org/officeDocument/2006/math" xmlns:v="urn:schemas-microsoft-com:vml" xmlns:wp14="http://schemas.microsoft.com/office/word/2010/wordprocessingDrawing" xmlns:wp="http://schemas.openxmlformats.org/drawingml/2006/wordprocessingDrawing" xmlns:w10="urn:schemas-microsoft-com:office:word" xmlns:w="http://schemas.openxmlformats.org/wordprocessingml/2006/main" xmlns:w14="http://schemas.microsoft.com/office/word/2010/wordml" xmlns:w15="http://schemas.microsoft.com/office/word/2012/wordml" xmlns:w16cex="http://schemas.microsoft.com/office/word/2018/wordml/cex" xmlns:w16cid="http://schemas.microsoft.com/office/word/2016/wordml/cid" xmlns:w16="http://schemas.microsoft.com/office/word/2018/wordml" xmlns:w16du="http://schemas.microsoft.com/office/word/2023/wordml/word16du" xmlns:w16sdtdh="http://schemas.microsoft.com/office/word/2020/wordml/sdtdatahash" xmlns:w16sdtfl="http://schemas.microsoft.com/office/word/2024/wordml/sdtformatlock" xmlns:w16se="http://schemas.microsoft.com/office/word/2015/wordml/symex" xmlns:wpg="http://schemas.microsoft.com/office/word/2010/wordprocessingGroup" xmlns:wpi="http://schemas.microsoft.com/office/word/2010/wordprocessingInk" xmlns:wne="http://schemas.microsoft.com/office/word/2006/wordml" xmlns:wps="http://schemas.microsoft.com/office/word/2010/wordprocessingShape" mc:Ignorable="w14 w15 w16se w16cid w16 w16cex w16sdtdh w16sdtfl w16du wp14">
   <w:body>
+    <w:p>
+      <w:pPr>
+        <w:rPr>
+          <w:rFonts w:eastAsiaTheme="minorEastAsia"/>
+        </w:rPr>
+      </w:pPr>
+      <w:r>
+        <w:rPr>
+          <w:rFonts w:eastAsiaTheme="minorEastAsia"/>
+        </w:rPr>
+        <w:t>Equations taken from Foundations of Game Engine Development Volume 2 by Eric Lengyel.</w:t>
+      </w:r>
+    </w:p>
+    <w:p>
+      <w:pPr>
+        <w:rPr>
+          <w:rFonts w:eastAsiaTheme="minorEastAsia"/>
+        </w:rPr>
+      </w:pPr>
+      <w:r>
+        <w:rPr>
+          <w:rFonts w:eastAsiaTheme="minorEastAsia"/>
+        </w:rPr>
+        <w:t>The subscript “frustum” means that the value is of the coordinate system “frustum.” I am open to changing this convention later if I find something better.</w:t>
+      </w:r>
+    </w:p>
     <w:p>
       <w:pPr>
         <w:rPr>
@@ -16,32 +42,55 @@
             </w:rPr>
             <m:t>s=</m:t>
           </m:r>
-          <m:f>
-            <m:fPr>
+          <m:sSub>
+            <m:sSubPr>
               <m:ctrlPr>
                 <w:rPr>
                   <w:rFonts w:ascii="Cambria Math" w:hAnsi="Cambria Math"/>
                   <w:i/>
                 </w:rPr>
               </m:ctrlPr>
-            </m:fPr>
-            <m:num>
+            </m:sSubPr>
+            <m:e>
+              <m:f>
+                <m:fPr>
+                  <m:ctrlPr>
+                    <w:rPr>
+                      <w:rFonts w:ascii="Cambria Math" w:hAnsi="Cambria Math"/>
+                      <w:i/>
+                    </w:rPr>
+                  </m:ctrlPr>
+                </m:fPr>
+                <m:num>
+                  <m:r>
+                    <w:rPr>
+                      <w:rFonts w:ascii="Cambria Math" w:hAnsi="Cambria Math"/>
+                    </w:rPr>
+                    <m:t>16</m:t>
+                  </m:r>
+                </m:num>
+                <m:den>
+                  <m:r>
+                    <w:rPr>
+                      <w:rFonts w:ascii="Cambria Math" w:hAnsi="Cambria Math"/>
+                    </w:rPr>
+                    <m:t>9</m:t>
+                  </m:r>
+                </m:den>
+              </m:f>
+            </m:e>
+            <m:sub>
               <m:r>
+                <m:rPr>
+                  <m:sty m:val="p"/>
+                </m:rPr>
                 <w:rPr>
                   <w:rFonts w:ascii="Cambria Math" w:hAnsi="Cambria Math"/>
                 </w:rPr>
-                <m:t>16</m:t>
+                <m:t>frustum</m:t>
               </m:r>
-            </m:num>
-            <m:den>
-              <m:r>
-                <w:rPr>
-                  <w:rFonts w:ascii="Cambria Math" w:hAnsi="Cambria Math"/>
-                </w:rPr>
-                <m:t>9</m:t>
-              </m:r>
-            </m:den>
-          </m:f>
+            </m:sub>
+          </m:sSub>
         </m:oMath>
       </m:oMathPara>
     </w:p>
@@ -334,12 +383,44 @@
             </w:rPr>
             <m:t>≈</m:t>
           </m:r>
-          <m:r>
-            <w:rPr>
-              <w:rFonts w:ascii="Cambria Math" w:eastAsiaTheme="minorEastAsia" w:hAnsi="Cambria Math"/>
-            </w:rPr>
-            <m:t>1.73205080756887729353</m:t>
-          </m:r>
+          <m:sSub>
+            <m:sSubPr>
+              <m:ctrlPr>
+                <w:rPr>
+                  <w:rFonts w:ascii="Cambria Math" w:eastAsiaTheme="minorEastAsia" w:hAnsi="Cambria Math"/>
+                  <w:i/>
+                </w:rPr>
+              </m:ctrlPr>
+            </m:sSubPr>
+            <m:e>
+              <m:r>
+                <w:rPr>
+                  <w:rFonts w:ascii="Cambria Math" w:eastAsiaTheme="minorEastAsia" w:hAnsi="Cambria Math"/>
+                </w:rPr>
+                <m:t>1.</m:t>
+              </m:r>
+              <m:r>
+                <m:rPr>
+                  <m:sty m:val="p"/>
+                </m:rPr>
+                <w:rPr>
+                  <w:rFonts w:ascii="Cambria Math" w:eastAsiaTheme="minorEastAsia" w:hAnsi="Cambria Math"/>
+                </w:rPr>
+                <m:t>73205080756887729353</m:t>
+              </m:r>
+            </m:e>
+            <m:sub>
+              <m:r>
+                <m:rPr>
+                  <m:sty m:val="p"/>
+                </m:rPr>
+                <w:rPr>
+                  <w:rFonts w:ascii="Cambria Math" w:eastAsiaTheme="minorEastAsia" w:hAnsi="Cambria Math"/>
+                </w:rPr>
+                <m:t>frustum</m:t>
+              </m:r>
+            </m:sub>
+          </m:sSub>
         </m:oMath>
       </m:oMathPara>
     </w:p>
@@ -505,8 +586,38 @@
             <w:rPr>
               <w:rFonts w:ascii="Cambria Math" w:eastAsiaTheme="minorEastAsia" w:hAnsi="Cambria Math"/>
             </w:rPr>
-            <m:t>f=100</m:t>
+            <m:t>f=</m:t>
           </m:r>
+          <m:sSub>
+            <m:sSubPr>
+              <m:ctrlPr>
+                <w:rPr>
+                  <w:rFonts w:ascii="Cambria Math" w:eastAsiaTheme="minorEastAsia" w:hAnsi="Cambria Math"/>
+                  <w:i/>
+                  <w:iCs/>
+                </w:rPr>
+              </m:ctrlPr>
+            </m:sSubPr>
+            <m:e>
+              <m:r>
+                <w:rPr>
+                  <w:rFonts w:ascii="Cambria Math" w:eastAsiaTheme="minorEastAsia" w:hAnsi="Cambria Math"/>
+                </w:rPr>
+                <m:t>100</m:t>
+              </m:r>
+            </m:e>
+            <m:sub>
+              <m:r>
+                <m:rPr>
+                  <m:sty m:val="p"/>
+                </m:rPr>
+                <w:rPr>
+                  <w:rFonts w:ascii="Cambria Math" w:eastAsiaTheme="minorEastAsia" w:hAnsi="Cambria Math"/>
+                </w:rPr>
+                <m:t>frustum</m:t>
+              </m:r>
+            </m:sub>
+          </m:sSub>
         </m:oMath>
       </m:oMathPara>
     </w:p>
@@ -523,8 +634,38 @@
             <w:rPr>
               <w:rFonts w:ascii="Cambria Math" w:eastAsiaTheme="minorEastAsia" w:hAnsi="Cambria Math"/>
             </w:rPr>
-            <m:t>n=0.1</m:t>
+            <m:t>n=</m:t>
           </m:r>
+          <m:sSub>
+            <m:sSubPr>
+              <m:ctrlPr>
+                <w:rPr>
+                  <w:rFonts w:ascii="Cambria Math" w:eastAsiaTheme="minorEastAsia" w:hAnsi="Cambria Math"/>
+                  <w:i/>
+                  <w:iCs/>
+                </w:rPr>
+              </m:ctrlPr>
+            </m:sSubPr>
+            <m:e>
+              <m:r>
+                <w:rPr>
+                  <w:rFonts w:ascii="Cambria Math" w:eastAsiaTheme="minorEastAsia" w:hAnsi="Cambria Math"/>
+                </w:rPr>
+                <m:t>0.1</m:t>
+              </m:r>
+            </m:e>
+            <m:sub>
+              <m:r>
+                <m:rPr>
+                  <m:sty m:val="p"/>
+                </m:rPr>
+                <w:rPr>
+                  <w:rFonts w:ascii="Cambria Math" w:eastAsiaTheme="minorEastAsia" w:hAnsi="Cambria Math"/>
+                </w:rPr>
+                <m:t>frustum</m:t>
+              </m:r>
+            </m:sub>
+          </m:sSub>
         </m:oMath>
       </m:oMathPara>
     </w:p>

</xml_diff>

<commit_message>
The matrix is now in there!
</commit_message>
<xml_diff>
--- a/math/projection.docx
+++ b/math/projection.docx
@@ -26,6 +26,33 @@
           <w:rFonts w:eastAsiaTheme="minorEastAsia"/>
         </w:rPr>
         <w:t>The subscript “frustum” means that the value is of the coordinate system “frustum.” I am open to changing this convention later if I find something better.</w:t>
+      </w:r>
+    </w:p>
+    <w:p>
+      <w:pPr>
+        <w:rPr>
+          <w:rFonts w:eastAsiaTheme="minorEastAsia"/>
+        </w:rPr>
+      </w:pPr>
+      <w:r>
+        <w:rPr>
+          <w:rFonts w:eastAsiaTheme="minorEastAsia"/>
+        </w:rPr>
+        <w:t xml:space="preserve">TODO: Change this to make it so that </w:t>
+      </w:r>
+      <w:r>
+        <w:rPr>
+          <w:rFonts w:eastAsiaTheme="minorEastAsia"/>
+          <w:i/>
+          <w:iCs/>
+        </w:rPr>
+        <w:t>s</w:t>
+      </w:r>
+      <w:r>
+        <w:rPr>
+          <w:rFonts w:eastAsiaTheme="minorEastAsia"/>
+        </w:rPr>
+        <w:t xml:space="preserve"> is a variable instead of a constant. This will become necessary in order to correctly render on widescreen monitors. </w:t>
       </w:r>
     </w:p>
     <w:p>

</xml_diff>

<commit_message>
Changed projection matrix to use aspect_ratio.
</commit_message>
<xml_diff>
--- a/math/projection.docx
+++ b/math/projection.docx
@@ -38,33 +38,6 @@
         <w:rPr>
           <w:rFonts w:eastAsiaTheme="minorEastAsia"/>
         </w:rPr>
-        <w:t xml:space="preserve">TODO: Change this to make it so that </w:t>
-      </w:r>
-      <w:r>
-        <w:rPr>
-          <w:rFonts w:eastAsiaTheme="minorEastAsia"/>
-          <w:i/>
-          <w:iCs/>
-        </w:rPr>
-        <w:t>s</w:t>
-      </w:r>
-      <w:r>
-        <w:rPr>
-          <w:rFonts w:eastAsiaTheme="minorEastAsia"/>
-        </w:rPr>
-        <w:t xml:space="preserve"> is a variable instead of a constant. This will become necessary in order to correctly render on widescreen monitors.</w:t>
-      </w:r>
-    </w:p>
-    <w:p>
-      <w:pPr>
-        <w:rPr>
-          <w:rFonts w:eastAsiaTheme="minorEastAsia"/>
-        </w:rPr>
-      </w:pPr>
-      <w:r>
-        <w:rPr>
-          <w:rFonts w:eastAsiaTheme="minorEastAsia"/>
-        </w:rPr>
         <w:t>TODO: Make the far plane infinitely far away.</w:t>
       </w:r>
     </w:p>
@@ -80,72 +53,6 @@
         </w:rPr>
         <w:t>TODO: Swap the z-axis so that way, precision increases the further you go forward.</w:t>
       </w:r>
-    </w:p>
-    <w:p>
-      <w:pPr>
-        <w:rPr>
-          <w:rFonts w:eastAsiaTheme="minorEastAsia"/>
-        </w:rPr>
-      </w:pPr>
-      <m:oMathPara>
-        <m:oMath>
-          <m:r>
-            <w:rPr>
-              <w:rFonts w:ascii="Cambria Math" w:hAnsi="Cambria Math"/>
-            </w:rPr>
-            <m:t>s=</m:t>
-          </m:r>
-          <m:sSub>
-            <m:sSubPr>
-              <m:ctrlPr>
-                <w:rPr>
-                  <w:rFonts w:ascii="Cambria Math" w:hAnsi="Cambria Math"/>
-                  <w:i/>
-                </w:rPr>
-              </m:ctrlPr>
-            </m:sSubPr>
-            <m:e>
-              <m:f>
-                <m:fPr>
-                  <m:ctrlPr>
-                    <w:rPr>
-                      <w:rFonts w:ascii="Cambria Math" w:hAnsi="Cambria Math"/>
-                      <w:i/>
-                    </w:rPr>
-                  </m:ctrlPr>
-                </m:fPr>
-                <m:num>
-                  <m:r>
-                    <w:rPr>
-                      <w:rFonts w:ascii="Cambria Math" w:hAnsi="Cambria Math"/>
-                    </w:rPr>
-                    <m:t>16</m:t>
-                  </m:r>
-                </m:num>
-                <m:den>
-                  <m:r>
-                    <w:rPr>
-                      <w:rFonts w:ascii="Cambria Math" w:hAnsi="Cambria Math"/>
-                    </w:rPr>
-                    <m:t>9</m:t>
-                  </m:r>
-                </m:den>
-              </m:f>
-            </m:e>
-            <m:sub>
-              <m:r>
-                <m:rPr>
-                  <m:sty m:val="p"/>
-                </m:rPr>
-                <w:rPr>
-                  <w:rFonts w:ascii="Cambria Math" w:hAnsi="Cambria Math"/>
-                </w:rPr>
-                <m:t>frustum</m:t>
-              </m:r>
-            </m:sub>
-          </m:sSub>
-        </m:oMath>
-      </m:oMathPara>
     </w:p>
     <w:p>
       <w:pPr>
@@ -486,155 +393,6 @@
       </w:pPr>
       <m:oMathPara>
         <m:oMath>
-          <m:sSub>
-            <m:sSubPr>
-              <m:ctrlPr>
-                <w:rPr>
-                  <w:rFonts w:ascii="Cambria Math" w:eastAsiaTheme="minorEastAsia" w:hAnsi="Cambria Math"/>
-                  <w:i/>
-                </w:rPr>
-              </m:ctrlPr>
-            </m:sSubPr>
-            <m:e>
-              <m:r>
-                <w:rPr>
-                  <w:rFonts w:ascii="Cambria Math" w:eastAsiaTheme="minorEastAsia" w:hAnsi="Cambria Math"/>
-                </w:rPr>
-                <m:t>φ</m:t>
-              </m:r>
-            </m:e>
-            <m:sub>
-              <m:r>
-                <w:rPr>
-                  <w:rFonts w:ascii="Cambria Math" w:eastAsiaTheme="minorEastAsia" w:hAnsi="Cambria Math"/>
-                </w:rPr>
-                <m:t>x</m:t>
-              </m:r>
-            </m:sub>
-          </m:sSub>
-          <m:r>
-            <w:rPr>
-              <w:rFonts w:ascii="Cambria Math" w:eastAsiaTheme="minorEastAsia" w:hAnsi="Cambria Math"/>
-            </w:rPr>
-            <m:t>=2</m:t>
-          </m:r>
-          <m:func>
-            <m:funcPr>
-              <m:ctrlPr>
-                <w:rPr>
-                  <w:rFonts w:ascii="Cambria Math" w:eastAsiaTheme="minorEastAsia" w:hAnsi="Cambria Math"/>
-                  <w:i/>
-                </w:rPr>
-              </m:ctrlPr>
-            </m:funcPr>
-            <m:fName>
-              <m:sSup>
-                <m:sSupPr>
-                  <m:ctrlPr>
-                    <w:rPr>
-                      <w:rFonts w:ascii="Cambria Math" w:eastAsiaTheme="minorEastAsia" w:hAnsi="Cambria Math"/>
-                      <w:i/>
-                    </w:rPr>
-                  </m:ctrlPr>
-                </m:sSupPr>
-                <m:e>
-                  <m:r>
-                    <m:rPr>
-                      <m:sty m:val="p"/>
-                    </m:rPr>
-                    <w:rPr>
-                      <w:rFonts w:ascii="Cambria Math" w:hAnsi="Cambria Math"/>
-                    </w:rPr>
-                    <m:t>tan</m:t>
-                  </m:r>
-                </m:e>
-                <m:sup>
-                  <m:r>
-                    <w:rPr>
-                      <w:rFonts w:ascii="Cambria Math" w:hAnsi="Cambria Math"/>
-                    </w:rPr>
-                    <m:t>-1</m:t>
-                  </m:r>
-                </m:sup>
-              </m:sSup>
-            </m:fName>
-            <m:e>
-              <m:f>
-                <m:fPr>
-                  <m:ctrlPr>
-                    <w:rPr>
-                      <w:rFonts w:ascii="Cambria Math" w:eastAsiaTheme="minorEastAsia" w:hAnsi="Cambria Math"/>
-                      <w:i/>
-                    </w:rPr>
-                  </m:ctrlPr>
-                </m:fPr>
-                <m:num>
-                  <m:r>
-                    <w:rPr>
-                      <w:rFonts w:ascii="Cambria Math" w:eastAsiaTheme="minorEastAsia" w:hAnsi="Cambria Math"/>
-                    </w:rPr>
-                    <m:t>s</m:t>
-                  </m:r>
-                </m:num>
-                <m:den>
-                  <m:r>
-                    <w:rPr>
-                      <w:rFonts w:ascii="Cambria Math" w:eastAsiaTheme="minorEastAsia" w:hAnsi="Cambria Math"/>
-                    </w:rPr>
-                    <m:t>g</m:t>
-                  </m:r>
-                </m:den>
-              </m:f>
-            </m:e>
-          </m:func>
-          <m:r>
-            <w:rPr>
-              <w:rFonts w:ascii="Cambria Math" w:eastAsiaTheme="minorEastAsia" w:hAnsi="Cambria Math"/>
-            </w:rPr>
-            <m:t>≈</m:t>
-          </m:r>
-          <m:r>
-            <w:rPr>
-              <w:rFonts w:ascii="Cambria Math" w:eastAsiaTheme="minorEastAsia" w:hAnsi="Cambria Math"/>
-            </w:rPr>
-            <m:t>0.25414679033243675288</m:t>
-          </m:r>
-          <m:r>
-            <w:rPr>
-              <w:rFonts w:ascii="Cambria Math" w:eastAsiaTheme="minorEastAsia" w:hAnsi="Cambria Math"/>
-            </w:rPr>
-            <m:t xml:space="preserve"> </m:t>
-          </m:r>
-          <m:r>
-            <m:rPr>
-              <m:sty m:val="p"/>
-            </m:rPr>
-            <w:rPr>
-              <w:rFonts w:ascii="Cambria Math" w:eastAsiaTheme="minorEastAsia" w:hAnsi="Cambria Math"/>
-            </w:rPr>
-            <m:t>t</m:t>
-          </m:r>
-          <m:r>
-            <m:rPr>
-              <m:sty m:val="p"/>
-            </m:rPr>
-            <w:rPr>
-              <w:rFonts w:ascii="Cambria Math" w:eastAsiaTheme="minorEastAsia" w:hAnsi="Cambria Math"/>
-            </w:rPr>
-            <m:t>r</m:t>
-          </m:r>
-        </m:oMath>
-      </m:oMathPara>
-    </w:p>
-    <w:p>
-      <w:pPr>
-        <w:rPr>
-          <w:rFonts w:eastAsiaTheme="minorEastAsia"/>
-          <w:iCs/>
-        </w:rPr>
-      </w:pPr>
-      <m:oMathPara>
-        <m:oMath>
           <m:r>
             <w:rPr>
               <w:rFonts w:ascii="Cambria Math" w:eastAsiaTheme="minorEastAsia" w:hAnsi="Cambria Math"/>
@@ -1245,7 +1003,18 @@
                         <w:sz w:val="20"/>
                         <w:szCs w:val="20"/>
                       </w:rPr>
-                      <m:t>0.97427857925749347761</m:t>
+                      <m:t>1.73205080756887729353</m:t>
+                    </m:r>
+                    <m:r>
+                      <m:rPr>
+                        <m:sty m:val="p"/>
+                      </m:rPr>
+                      <w:rPr>
+                        <w:rFonts w:ascii="Cambria Math" w:eastAsiaTheme="minorEastAsia" w:hAnsi="Cambria Math"/>
+                        <w:sz w:val="20"/>
+                        <w:szCs w:val="20"/>
+                      </w:rPr>
+                      <m:t>/s</m:t>
                     </m:r>
                     <m:ctrlPr>
                       <w:rPr>
@@ -1545,6 +1314,25 @@
           </m:d>
         </m:oMath>
       </m:oMathPara>
+    </w:p>
+    <w:p>
+      <w:pPr>
+        <w:rPr>
+          <w:rFonts w:eastAsiaTheme="minorEastAsia"/>
+          <w:iCs/>
+          <w:sz w:val="20"/>
+          <w:szCs w:val="20"/>
+        </w:rPr>
+      </w:pPr>
+      <w:r>
+        <w:rPr>
+          <w:rFonts w:eastAsiaTheme="minorEastAsia"/>
+          <w:iCs/>
+          <w:sz w:val="20"/>
+          <w:szCs w:val="20"/>
+        </w:rPr>
+        <w:t>Where s denotes the aspect ratio.</w:t>
+      </w:r>
     </w:p>
     <w:sectPr>
       <w:pgSz w:w="12240" w:h="15840"/>
@@ -2159,6 +1947,7 @@
   <w:style w:type="character" w:default="1" w:styleId="DefaultParagraphFont">
     <w:name w:val="Default Paragraph Font"/>
     <w:uiPriority w:val="1"/>
+    <w:semiHidden/>
     <w:unhideWhenUsed/>
   </w:style>
   <w:style w:type="table" w:default="1" w:styleId="TableNormal">

</xml_diff>

<commit_message>
Switched to using an infinite projection matrix where the precision increases as distance from the camera increases.
</commit_message>
<xml_diff>
--- a/math/projection.docx
+++ b/math/projection.docx
@@ -5,12 +5,12 @@
     <w:p>
       <w:pPr>
         <w:rPr>
-          <w:rFonts w:eastAsiaTheme="minorEastAsia"/>
+          <w:rFonts w:ascii="Cambria" w:eastAsiaTheme="minorEastAsia" w:hAnsi="Cambria" w:cs="Times New Roman"/>
         </w:rPr>
       </w:pPr>
       <w:r>
         <w:rPr>
-          <w:rFonts w:eastAsiaTheme="minorEastAsia"/>
+          <w:rFonts w:ascii="Cambria" w:eastAsiaTheme="minorEastAsia" w:hAnsi="Cambria" w:cs="Times New Roman"/>
         </w:rPr>
         <w:t>Equations taken from Foundations of Game Engine Development Volume 2 by Eric Lengyel.</w:t>
       </w:r>
@@ -18,12 +18,12 @@
     <w:p>
       <w:pPr>
         <w:rPr>
-          <w:rFonts w:eastAsiaTheme="minorEastAsia"/>
+          <w:rFonts w:ascii="Cambria" w:eastAsiaTheme="minorEastAsia" w:hAnsi="Cambria" w:cs="Times New Roman"/>
         </w:rPr>
       </w:pPr>
       <w:r>
         <w:rPr>
-          <w:rFonts w:eastAsiaTheme="minorEastAsia"/>
+          <w:rFonts w:ascii="Cambria" w:eastAsiaTheme="minorEastAsia" w:hAnsi="Cambria" w:cs="Times New Roman"/>
         </w:rPr>
         <w:t>The subscript “frustum” means that the value is of the coordinate system “frustum.” I am open to changing this convention later if I find something better.</w:t>
       </w:r>
@@ -31,33 +31,7 @@
     <w:p>
       <w:pPr>
         <w:rPr>
-          <w:rFonts w:eastAsiaTheme="minorEastAsia"/>
-        </w:rPr>
-      </w:pPr>
-      <w:r>
-        <w:rPr>
-          <w:rFonts w:eastAsiaTheme="minorEastAsia"/>
-        </w:rPr>
-        <w:t>TODO: Make the far plane infinitely far away.</w:t>
-      </w:r>
-    </w:p>
-    <w:p>
-      <w:pPr>
-        <w:rPr>
-          <w:rFonts w:eastAsiaTheme="minorEastAsia"/>
-        </w:rPr>
-      </w:pPr>
-      <w:r>
-        <w:rPr>
-          <w:rFonts w:eastAsiaTheme="minorEastAsia"/>
-        </w:rPr>
-        <w:t>TODO: Swap the z-axis so that way, precision increases the further you go forward.</w:t>
-      </w:r>
-    </w:p>
-    <w:p>
-      <w:pPr>
-        <w:rPr>
-          <w:rFonts w:eastAsiaTheme="minorEastAsia"/>
+          <w:rFonts w:ascii="Cambria" w:eastAsiaTheme="minorEastAsia" w:hAnsi="Cambria" w:cs="Times New Roman"/>
           <w:iCs/>
         </w:rPr>
       </w:pPr>
@@ -67,7 +41,7 @@
             <m:sSubPr>
               <m:ctrlPr>
                 <w:rPr>
-                  <w:rFonts w:ascii="Cambria Math" w:eastAsiaTheme="minorEastAsia" w:hAnsi="Cambria Math"/>
+                  <w:rFonts w:ascii="Cambria Math" w:eastAsiaTheme="minorEastAsia" w:hAnsi="Cambria Math" w:cs="Times New Roman"/>
                   <w:i/>
                 </w:rPr>
               </m:ctrlPr>
@@ -75,7 +49,7 @@
             <m:e>
               <m:r>
                 <w:rPr>
-                  <w:rFonts w:ascii="Cambria Math" w:eastAsiaTheme="minorEastAsia" w:hAnsi="Cambria Math"/>
+                  <w:rFonts w:ascii="Cambria Math" w:eastAsiaTheme="minorEastAsia" w:hAnsi="Cambria Math" w:cs="Times New Roman"/>
                 </w:rPr>
                 <m:t>φ</m:t>
               </m:r>
@@ -83,7 +57,7 @@
             <m:sub>
               <m:r>
                 <w:rPr>
-                  <w:rFonts w:ascii="Cambria Math" w:eastAsiaTheme="minorEastAsia" w:hAnsi="Cambria Math"/>
+                  <w:rFonts w:ascii="Cambria Math" w:eastAsiaTheme="minorEastAsia" w:hAnsi="Cambria Math" w:cs="Times New Roman"/>
                 </w:rPr>
                 <m:t>y</m:t>
               </m:r>
@@ -91,7 +65,7 @@
           </m:sSub>
           <m:r>
             <w:rPr>
-              <w:rFonts w:ascii="Cambria Math" w:eastAsiaTheme="minorEastAsia" w:hAnsi="Cambria Math"/>
+              <w:rFonts w:ascii="Cambria Math" w:eastAsiaTheme="minorEastAsia" w:hAnsi="Cambria Math" w:cs="Times New Roman"/>
             </w:rPr>
             <m:t>=</m:t>
           </m:r>
@@ -99,7 +73,7 @@
             <m:fPr>
               <m:ctrlPr>
                 <w:rPr>
-                  <w:rFonts w:ascii="Cambria Math" w:eastAsiaTheme="minorEastAsia" w:hAnsi="Cambria Math"/>
+                  <w:rFonts w:ascii="Cambria Math" w:eastAsiaTheme="minorEastAsia" w:hAnsi="Cambria Math" w:cs="Times New Roman"/>
                   <w:i/>
                 </w:rPr>
               </m:ctrlPr>
@@ -107,7 +81,7 @@
             <m:num>
               <m:r>
                 <w:rPr>
-                  <w:rFonts w:ascii="Cambria Math" w:eastAsiaTheme="minorEastAsia" w:hAnsi="Cambria Math"/>
+                  <w:rFonts w:ascii="Cambria Math" w:eastAsiaTheme="minorEastAsia" w:hAnsi="Cambria Math" w:cs="Times New Roman"/>
                 </w:rPr>
                 <m:t>1</m:t>
               </m:r>
@@ -115,7 +89,7 @@
             <m:den>
               <m:r>
                 <w:rPr>
-                  <w:rFonts w:ascii="Cambria Math" w:eastAsiaTheme="minorEastAsia" w:hAnsi="Cambria Math"/>
+                  <w:rFonts w:ascii="Cambria Math" w:eastAsiaTheme="minorEastAsia" w:hAnsi="Cambria Math" w:cs="Times New Roman"/>
                 </w:rPr>
                 <m:t>6</m:t>
               </m:r>
@@ -126,7 +100,7 @@
               <m:sty m:val="p"/>
             </m:rPr>
             <w:rPr>
-              <w:rFonts w:ascii="Cambria Math" w:eastAsiaTheme="minorEastAsia" w:hAnsi="Cambria Math"/>
+              <w:rFonts w:ascii="Cambria Math" w:eastAsiaTheme="minorEastAsia" w:hAnsi="Cambria Math" w:cs="Times New Roman"/>
             </w:rPr>
             <m:t>tr</m:t>
           </m:r>
@@ -136,7 +110,7 @@
     <w:p>
       <w:pPr>
         <w:rPr>
-          <w:rFonts w:eastAsiaTheme="minorEastAsia"/>
+          <w:rFonts w:ascii="Cambria" w:eastAsiaTheme="minorEastAsia" w:hAnsi="Cambria" w:cs="Times New Roman"/>
         </w:rPr>
       </w:pPr>
       <m:oMathPara>
@@ -145,7 +119,7 @@
             <m:funcPr>
               <m:ctrlPr>
                 <w:rPr>
-                  <w:rFonts w:ascii="Cambria Math" w:eastAsiaTheme="minorEastAsia" w:hAnsi="Cambria Math"/>
+                  <w:rFonts w:ascii="Cambria Math" w:eastAsiaTheme="minorEastAsia" w:hAnsi="Cambria Math" w:cs="Times New Roman"/>
                   <w:i/>
                 </w:rPr>
               </m:ctrlPr>
@@ -156,7 +130,7 @@
                   <m:sty m:val="p"/>
                 </m:rPr>
                 <w:rPr>
-                  <w:rFonts w:ascii="Cambria Math" w:hAnsi="Cambria Math"/>
+                  <w:rFonts w:ascii="Cambria Math" w:hAnsi="Cambria Math" w:cs="Times New Roman"/>
                 </w:rPr>
                 <m:t>tan</m:t>
               </m:r>
@@ -166,7 +140,7 @@
                 <m:fPr>
                   <m:ctrlPr>
                     <w:rPr>
-                      <w:rFonts w:ascii="Cambria Math" w:eastAsiaTheme="minorEastAsia" w:hAnsi="Cambria Math"/>
+                      <w:rFonts w:ascii="Cambria Math" w:eastAsiaTheme="minorEastAsia" w:hAnsi="Cambria Math" w:cs="Times New Roman"/>
                       <w:i/>
                     </w:rPr>
                   </m:ctrlPr>
@@ -176,7 +150,7 @@
                     <m:sSubPr>
                       <m:ctrlPr>
                         <w:rPr>
-                          <w:rFonts w:ascii="Cambria Math" w:eastAsiaTheme="minorEastAsia" w:hAnsi="Cambria Math"/>
+                          <w:rFonts w:ascii="Cambria Math" w:eastAsiaTheme="minorEastAsia" w:hAnsi="Cambria Math" w:cs="Times New Roman"/>
                           <w:i/>
                         </w:rPr>
                       </m:ctrlPr>
@@ -184,7 +158,7 @@
                     <m:e>
                       <m:r>
                         <w:rPr>
-                          <w:rFonts w:ascii="Cambria Math" w:eastAsiaTheme="minorEastAsia" w:hAnsi="Cambria Math"/>
+                          <w:rFonts w:ascii="Cambria Math" w:eastAsiaTheme="minorEastAsia" w:hAnsi="Cambria Math" w:cs="Times New Roman"/>
                         </w:rPr>
                         <m:t>φ</m:t>
                       </m:r>
@@ -192,7 +166,7 @@
                     <m:sub>
                       <m:r>
                         <w:rPr>
-                          <w:rFonts w:ascii="Cambria Math" w:eastAsiaTheme="minorEastAsia" w:hAnsi="Cambria Math"/>
+                          <w:rFonts w:ascii="Cambria Math" w:eastAsiaTheme="minorEastAsia" w:hAnsi="Cambria Math" w:cs="Times New Roman"/>
                         </w:rPr>
                         <m:t>y</m:t>
                       </m:r>
@@ -202,7 +176,7 @@
                 <m:den>
                   <m:r>
                     <w:rPr>
-                      <w:rFonts w:ascii="Cambria Math" w:eastAsiaTheme="minorEastAsia" w:hAnsi="Cambria Math"/>
+                      <w:rFonts w:ascii="Cambria Math" w:eastAsiaTheme="minorEastAsia" w:hAnsi="Cambria Math" w:cs="Times New Roman"/>
                     </w:rPr>
                     <m:t>2</m:t>
                   </m:r>
@@ -212,7 +186,7 @@
           </m:func>
           <m:r>
             <w:rPr>
-              <w:rFonts w:ascii="Cambria Math" w:eastAsiaTheme="minorEastAsia" w:hAnsi="Cambria Math"/>
+              <w:rFonts w:ascii="Cambria Math" w:eastAsiaTheme="minorEastAsia" w:hAnsi="Cambria Math" w:cs="Times New Roman"/>
             </w:rPr>
             <m:t>=</m:t>
           </m:r>
@@ -220,7 +194,7 @@
             <m:fPr>
               <m:ctrlPr>
                 <w:rPr>
-                  <w:rFonts w:ascii="Cambria Math" w:eastAsiaTheme="minorEastAsia" w:hAnsi="Cambria Math"/>
+                  <w:rFonts w:ascii="Cambria Math" w:eastAsiaTheme="minorEastAsia" w:hAnsi="Cambria Math" w:cs="Times New Roman"/>
                   <w:i/>
                 </w:rPr>
               </m:ctrlPr>
@@ -228,7 +202,7 @@
             <m:num>
               <m:r>
                 <w:rPr>
-                  <w:rFonts w:ascii="Cambria Math" w:eastAsiaTheme="minorEastAsia" w:hAnsi="Cambria Math"/>
+                  <w:rFonts w:ascii="Cambria Math" w:eastAsiaTheme="minorEastAsia" w:hAnsi="Cambria Math" w:cs="Times New Roman"/>
                 </w:rPr>
                 <m:t>1</m:t>
               </m:r>
@@ -236,7 +210,7 @@
             <m:den>
               <m:r>
                 <w:rPr>
-                  <w:rFonts w:ascii="Cambria Math" w:eastAsiaTheme="minorEastAsia" w:hAnsi="Cambria Math"/>
+                  <w:rFonts w:ascii="Cambria Math" w:eastAsiaTheme="minorEastAsia" w:hAnsi="Cambria Math" w:cs="Times New Roman"/>
                 </w:rPr>
                 <m:t>g</m:t>
               </m:r>
@@ -244,7 +218,7 @@
           </m:f>
           <m:r>
             <w:rPr>
-              <w:rFonts w:ascii="Cambria Math" w:eastAsiaTheme="minorEastAsia" w:hAnsi="Cambria Math"/>
+              <w:rFonts w:ascii="Cambria Math" w:eastAsiaTheme="minorEastAsia" w:hAnsi="Cambria Math" w:cs="Times New Roman"/>
             </w:rPr>
             <m:t>⇒g=</m:t>
           </m:r>
@@ -252,7 +226,7 @@
             <m:fPr>
               <m:ctrlPr>
                 <w:rPr>
-                  <w:rFonts w:ascii="Cambria Math" w:eastAsiaTheme="minorEastAsia" w:hAnsi="Cambria Math"/>
+                  <w:rFonts w:ascii="Cambria Math" w:eastAsiaTheme="minorEastAsia" w:hAnsi="Cambria Math" w:cs="Times New Roman"/>
                   <w:i/>
                 </w:rPr>
               </m:ctrlPr>
@@ -260,7 +234,7 @@
             <m:num>
               <m:r>
                 <w:rPr>
-                  <w:rFonts w:ascii="Cambria Math" w:eastAsiaTheme="minorEastAsia" w:hAnsi="Cambria Math"/>
+                  <w:rFonts w:ascii="Cambria Math" w:eastAsiaTheme="minorEastAsia" w:hAnsi="Cambria Math" w:cs="Times New Roman"/>
                 </w:rPr>
                 <m:t>1</m:t>
               </m:r>
@@ -270,7 +244,7 @@
                 <m:funcPr>
                   <m:ctrlPr>
                     <w:rPr>
-                      <w:rFonts w:ascii="Cambria Math" w:eastAsiaTheme="minorEastAsia" w:hAnsi="Cambria Math"/>
+                      <w:rFonts w:ascii="Cambria Math" w:eastAsiaTheme="minorEastAsia" w:hAnsi="Cambria Math" w:cs="Times New Roman"/>
                       <w:i/>
                     </w:rPr>
                   </m:ctrlPr>
@@ -281,7 +255,7 @@
                       <m:sty m:val="p"/>
                     </m:rPr>
                     <w:rPr>
-                      <w:rFonts w:ascii="Cambria Math" w:hAnsi="Cambria Math"/>
+                      <w:rFonts w:ascii="Cambria Math" w:hAnsi="Cambria Math" w:cs="Times New Roman"/>
                     </w:rPr>
                     <m:t>tan</m:t>
                   </m:r>
@@ -291,7 +265,7 @@
                     <m:fPr>
                       <m:ctrlPr>
                         <w:rPr>
-                          <w:rFonts w:ascii="Cambria Math" w:eastAsiaTheme="minorEastAsia" w:hAnsi="Cambria Math"/>
+                          <w:rFonts w:ascii="Cambria Math" w:eastAsiaTheme="minorEastAsia" w:hAnsi="Cambria Math" w:cs="Times New Roman"/>
                           <w:i/>
                         </w:rPr>
                       </m:ctrlPr>
@@ -301,7 +275,7 @@
                         <m:sSubPr>
                           <m:ctrlPr>
                             <w:rPr>
-                              <w:rFonts w:ascii="Cambria Math" w:eastAsiaTheme="minorEastAsia" w:hAnsi="Cambria Math"/>
+                              <w:rFonts w:ascii="Cambria Math" w:eastAsiaTheme="minorEastAsia" w:hAnsi="Cambria Math" w:cs="Times New Roman"/>
                               <w:i/>
                             </w:rPr>
                           </m:ctrlPr>
@@ -309,7 +283,7 @@
                         <m:e>
                           <m:r>
                             <w:rPr>
-                              <w:rFonts w:ascii="Cambria Math" w:eastAsiaTheme="minorEastAsia" w:hAnsi="Cambria Math"/>
+                              <w:rFonts w:ascii="Cambria Math" w:eastAsiaTheme="minorEastAsia" w:hAnsi="Cambria Math" w:cs="Times New Roman"/>
                             </w:rPr>
                             <m:t>φ</m:t>
                           </m:r>
@@ -317,7 +291,7 @@
                         <m:sub>
                           <m:r>
                             <w:rPr>
-                              <w:rFonts w:ascii="Cambria Math" w:eastAsiaTheme="minorEastAsia" w:hAnsi="Cambria Math"/>
+                              <w:rFonts w:ascii="Cambria Math" w:eastAsiaTheme="minorEastAsia" w:hAnsi="Cambria Math" w:cs="Times New Roman"/>
                             </w:rPr>
                             <m:t>y</m:t>
                           </m:r>
@@ -327,7 +301,7 @@
                     <m:den>
                       <m:r>
                         <w:rPr>
-                          <w:rFonts w:ascii="Cambria Math" w:eastAsiaTheme="minorEastAsia" w:hAnsi="Cambria Math"/>
+                          <w:rFonts w:ascii="Cambria Math" w:eastAsiaTheme="minorEastAsia" w:hAnsi="Cambria Math" w:cs="Times New Roman"/>
                         </w:rPr>
                         <m:t>2</m:t>
                       </m:r>
@@ -339,7 +313,7 @@
           </m:f>
           <m:r>
             <w:rPr>
-              <w:rFonts w:ascii="Cambria Math" w:eastAsiaTheme="minorEastAsia" w:hAnsi="Cambria Math"/>
+              <w:rFonts w:ascii="Cambria Math" w:eastAsiaTheme="minorEastAsia" w:hAnsi="Cambria Math" w:cs="Times New Roman"/>
             </w:rPr>
             <m:t>≈</m:t>
           </m:r>
@@ -347,7 +321,7 @@
             <m:sSubPr>
               <m:ctrlPr>
                 <w:rPr>
-                  <w:rFonts w:ascii="Cambria Math" w:eastAsiaTheme="minorEastAsia" w:hAnsi="Cambria Math"/>
+                  <w:rFonts w:ascii="Cambria Math" w:eastAsiaTheme="minorEastAsia" w:hAnsi="Cambria Math" w:cs="Times New Roman"/>
                   <w:i/>
                 </w:rPr>
               </m:ctrlPr>
@@ -355,7 +329,7 @@
             <m:e>
               <m:r>
                 <w:rPr>
-                  <w:rFonts w:ascii="Cambria Math" w:eastAsiaTheme="minorEastAsia" w:hAnsi="Cambria Math"/>
+                  <w:rFonts w:ascii="Cambria Math" w:eastAsiaTheme="minorEastAsia" w:hAnsi="Cambria Math" w:cs="Times New Roman"/>
                 </w:rPr>
                 <m:t>1.</m:t>
               </m:r>
@@ -364,7 +338,7 @@
                   <m:sty m:val="p"/>
                 </m:rPr>
                 <w:rPr>
-                  <w:rFonts w:ascii="Cambria Math" w:eastAsiaTheme="minorEastAsia" w:hAnsi="Cambria Math"/>
+                  <w:rFonts w:ascii="Cambria Math" w:eastAsiaTheme="minorEastAsia" w:hAnsi="Cambria Math" w:cs="Times New Roman"/>
                 </w:rPr>
                 <m:t>73205080756887729353</m:t>
               </m:r>
@@ -375,7 +349,7 @@
                   <m:sty m:val="p"/>
                 </m:rPr>
                 <w:rPr>
-                  <w:rFonts w:ascii="Cambria Math" w:eastAsiaTheme="minorEastAsia" w:hAnsi="Cambria Math"/>
+                  <w:rFonts w:ascii="Cambria Math" w:eastAsiaTheme="minorEastAsia" w:hAnsi="Cambria Math" w:cs="Times New Roman"/>
                 </w:rPr>
                 <m:t>frustum</m:t>
               </m:r>
@@ -387,103 +361,67 @@
     <w:p>
       <w:pPr>
         <w:rPr>
-          <w:rFonts w:eastAsiaTheme="minorEastAsia"/>
-          <w:iCs/>
+          <w:rFonts w:ascii="Cambria" w:eastAsiaTheme="minorEastAsia" w:hAnsi="Cambria" w:cs="Times New Roman"/>
         </w:rPr>
       </w:pPr>
       <m:oMathPara>
         <m:oMath>
           <m:r>
             <w:rPr>
-              <w:rFonts w:ascii="Cambria Math" w:eastAsiaTheme="minorEastAsia" w:hAnsi="Cambria Math"/>
+              <w:rFonts w:ascii="Cambria Math" w:eastAsiaTheme="minorEastAsia" w:hAnsi="Cambria Math" w:cs="Times New Roman"/>
             </w:rPr>
-            <m:t>f=</m:t>
+            <m:t>n=0.1</m:t>
           </m:r>
-          <m:sSub>
-            <m:sSubPr>
-              <m:ctrlPr>
-                <w:rPr>
-                  <w:rFonts w:ascii="Cambria Math" w:eastAsiaTheme="minorEastAsia" w:hAnsi="Cambria Math"/>
-                  <w:i/>
-                  <w:iCs/>
-                </w:rPr>
-              </m:ctrlPr>
-            </m:sSubPr>
-            <m:e>
-              <m:r>
-                <w:rPr>
-                  <w:rFonts w:ascii="Cambria Math" w:eastAsiaTheme="minorEastAsia" w:hAnsi="Cambria Math"/>
-                </w:rPr>
-                <m:t>100</m:t>
-              </m:r>
-            </m:e>
-            <m:sub>
-              <m:r>
-                <m:rPr>
-                  <m:sty m:val="p"/>
-                </m:rPr>
-                <w:rPr>
-                  <w:rFonts w:ascii="Cambria Math" w:eastAsiaTheme="minorEastAsia" w:hAnsi="Cambria Math"/>
-                </w:rPr>
-                <m:t>frustum</m:t>
-              </m:r>
-            </m:sub>
-          </m:sSub>
         </m:oMath>
       </m:oMathPara>
     </w:p>
     <w:p>
       <w:pPr>
         <w:rPr>
-          <w:rFonts w:eastAsiaTheme="minorEastAsia"/>
-          <w:iCs/>
+          <w:rFonts w:ascii="Cambria" w:eastAsiaTheme="minorEastAsia" w:hAnsi="Cambria" w:cs="Times New Roman"/>
         </w:rPr>
       </w:pPr>
       <m:oMathPara>
         <m:oMath>
           <m:r>
             <w:rPr>
-              <w:rFonts w:ascii="Cambria Math" w:eastAsiaTheme="minorEastAsia" w:hAnsi="Cambria Math"/>
+              <w:rFonts w:ascii="Cambria Math" w:eastAsiaTheme="minorEastAsia" w:hAnsi="Cambria Math" w:cs="Times New Roman"/>
             </w:rPr>
-            <m:t>n=</m:t>
+            <m:t>ε=</m:t>
           </m:r>
-          <m:sSub>
-            <m:sSubPr>
+          <m:sSup>
+            <m:sSupPr>
               <m:ctrlPr>
                 <w:rPr>
-                  <w:rFonts w:ascii="Cambria Math" w:eastAsiaTheme="minorEastAsia" w:hAnsi="Cambria Math"/>
+                  <w:rFonts w:ascii="Cambria Math" w:eastAsiaTheme="minorEastAsia" w:hAnsi="Cambria Math" w:cs="Times New Roman"/>
                   <w:i/>
-                  <w:iCs/>
                 </w:rPr>
               </m:ctrlPr>
-            </m:sSubPr>
+            </m:sSupPr>
             <m:e>
               <m:r>
                 <w:rPr>
-                  <w:rFonts w:ascii="Cambria Math" w:eastAsiaTheme="minorEastAsia" w:hAnsi="Cambria Math"/>
+                  <w:rFonts w:ascii="Cambria Math" w:eastAsiaTheme="minorEastAsia" w:hAnsi="Cambria Math" w:cs="Times New Roman"/>
                 </w:rPr>
-                <m:t>0.1</m:t>
+                <m:t>2</m:t>
               </m:r>
             </m:e>
-            <m:sub>
+            <m:sup>
               <m:r>
-                <m:rPr>
-                  <m:sty m:val="p"/>
-                </m:rPr>
                 <w:rPr>
-                  <w:rFonts w:ascii="Cambria Math" w:eastAsiaTheme="minorEastAsia" w:hAnsi="Cambria Math"/>
+                  <w:rFonts w:ascii="Cambria Math" w:eastAsiaTheme="minorEastAsia" w:hAnsi="Cambria Math" w:cs="Times New Roman"/>
                 </w:rPr>
-                <m:t>frustum</m:t>
+                <m:t>-20</m:t>
               </m:r>
-            </m:sub>
-          </m:sSub>
+            </m:sup>
+          </m:sSup>
         </m:oMath>
       </m:oMathPara>
     </w:p>
     <w:p>
       <w:pPr>
         <w:rPr>
-          <w:rFonts w:eastAsiaTheme="minorEastAsia"/>
+          <w:rFonts w:ascii="Cambria" w:eastAsiaTheme="minorEastAsia" w:hAnsi="Cambria" w:cs="Times New Roman"/>
           <w:iCs/>
           <w:sz w:val="20"/>
           <w:szCs w:val="20"/>
@@ -495,7 +433,7 @@
             <m:sSubPr>
               <m:ctrlPr>
                 <w:rPr>
-                  <w:rFonts w:ascii="Cambria Math" w:eastAsiaTheme="minorEastAsia" w:hAnsi="Cambria Math"/>
+                  <w:rFonts w:ascii="Cambria Math" w:eastAsiaTheme="minorEastAsia" w:hAnsi="Cambria Math" w:cs="Times New Roman"/>
                   <w:b/>
                   <w:bCs/>
                   <w:sz w:val="20"/>
@@ -509,7 +447,7 @@
                   <m:sty m:val="b"/>
                 </m:rPr>
                 <w:rPr>
-                  <w:rFonts w:ascii="Cambria Math" w:eastAsiaTheme="minorEastAsia" w:hAnsi="Cambria Math"/>
+                  <w:rFonts w:ascii="Cambria Math" w:eastAsiaTheme="minorEastAsia" w:hAnsi="Cambria Math" w:cs="Times New Roman"/>
                   <w:sz w:val="20"/>
                   <w:szCs w:val="20"/>
                 </w:rPr>
@@ -522,7 +460,7 @@
                   <m:sty m:val="p"/>
                 </m:rPr>
                 <w:rPr>
-                  <w:rFonts w:ascii="Cambria Math" w:eastAsiaTheme="minorEastAsia" w:hAnsi="Cambria Math"/>
+                  <w:rFonts w:ascii="Cambria Math" w:eastAsiaTheme="minorEastAsia" w:hAnsi="Cambria Math" w:cs="Times New Roman"/>
                   <w:sz w:val="20"/>
                   <w:szCs w:val="20"/>
                 </w:rPr>
@@ -535,7 +473,7 @@
               <m:sty m:val="bi"/>
             </m:rPr>
             <w:rPr>
-              <w:rFonts w:ascii="Cambria Math" w:eastAsiaTheme="minorEastAsia" w:hAnsi="Cambria Math"/>
+              <w:rFonts w:ascii="Cambria Math" w:eastAsiaTheme="minorEastAsia" w:hAnsi="Cambria Math" w:cs="Times New Roman"/>
               <w:sz w:val="20"/>
               <w:szCs w:val="20"/>
             </w:rPr>
@@ -547,7 +485,7 @@
               <m:endChr m:val="]"/>
               <m:ctrlPr>
                 <w:rPr>
-                  <w:rFonts w:ascii="Cambria Math" w:eastAsiaTheme="minorEastAsia" w:hAnsi="Cambria Math"/>
+                  <w:rFonts w:ascii="Cambria Math" w:eastAsiaTheme="minorEastAsia" w:hAnsi="Cambria Math" w:cs="Times New Roman"/>
                   <w:iCs/>
                   <w:sz w:val="20"/>
                   <w:szCs w:val="20"/>
@@ -567,7 +505,8 @@
                   </m:mcs>
                   <m:ctrlPr>
                     <w:rPr>
-                      <w:rFonts w:ascii="Cambria Math" w:eastAsiaTheme="minorEastAsia" w:hAnsi="Cambria Math"/>
+                      <w:rFonts w:ascii="Cambria Math" w:eastAsiaTheme="minorEastAsia" w:hAnsi="Cambria Math" w:cs="Times New Roman"/>
+                      <w:i/>
                       <w:iCs/>
                       <w:sz w:val="20"/>
                       <w:szCs w:val="20"/>
@@ -577,11 +516,8 @@
                 <m:mr>
                   <m:e>
                     <m:r>
-                      <m:rPr>
-                        <m:sty m:val="p"/>
-                      </m:rPr>
-                      <w:rPr>
-                        <w:rFonts w:ascii="Cambria Math" w:eastAsiaTheme="minorEastAsia" w:hAnsi="Cambria Math"/>
+                      <w:rPr>
+                        <w:rFonts w:ascii="Cambria Math" w:eastAsiaTheme="minorEastAsia" w:hAnsi="Cambria Math" w:cs="Times New Roman"/>
                         <w:sz w:val="20"/>
                         <w:szCs w:val="20"/>
                       </w:rPr>
@@ -589,7 +525,8 @@
                     </m:r>
                     <m:ctrlPr>
                       <w:rPr>
-                        <w:rFonts w:ascii="Cambria Math" w:eastAsia="Cambria Math" w:hAnsi="Cambria Math" w:cs="Cambria Math"/>
+                        <w:rFonts w:ascii="Cambria Math" w:eastAsia="Cambria Math" w:hAnsi="Cambria Math" w:cs="Times New Roman"/>
+                        <w:i/>
                         <w:iCs/>
                         <w:sz w:val="20"/>
                         <w:szCs w:val="20"/>
@@ -598,11 +535,8 @@
                   </m:e>
                   <m:e>
                     <m:r>
-                      <m:rPr>
-                        <m:sty m:val="p"/>
-                      </m:rPr>
-                      <w:rPr>
-                        <w:rFonts w:ascii="Cambria Math" w:eastAsia="Cambria Math" w:hAnsi="Cambria Math" w:cs="Cambria Math"/>
+                      <w:rPr>
+                        <w:rFonts w:ascii="Cambria Math" w:eastAsia="Cambria Math" w:hAnsi="Cambria Math" w:cs="Times New Roman"/>
                         <w:sz w:val="20"/>
                         <w:szCs w:val="20"/>
                       </w:rPr>
@@ -610,7 +544,8 @@
                     </m:r>
                     <m:ctrlPr>
                       <w:rPr>
-                        <w:rFonts w:ascii="Cambria Math" w:eastAsia="Cambria Math" w:hAnsi="Cambria Math" w:cs="Cambria Math"/>
+                        <w:rFonts w:ascii="Cambria Math" w:eastAsia="Cambria Math" w:hAnsi="Cambria Math" w:cs="Times New Roman"/>
+                        <w:i/>
                         <w:iCs/>
                         <w:sz w:val="20"/>
                         <w:szCs w:val="20"/>
@@ -619,11 +554,8 @@
                   </m:e>
                   <m:e>
                     <m:r>
-                      <m:rPr>
-                        <m:sty m:val="p"/>
-                      </m:rPr>
-                      <w:rPr>
-                        <w:rFonts w:ascii="Cambria Math" w:eastAsia="Cambria Math" w:hAnsi="Cambria Math" w:cs="Cambria Math"/>
+                      <w:rPr>
+                        <w:rFonts w:ascii="Cambria Math" w:eastAsia="Cambria Math" w:hAnsi="Cambria Math" w:cs="Times New Roman"/>
                         <w:sz w:val="20"/>
                         <w:szCs w:val="20"/>
                       </w:rPr>
@@ -631,7 +563,8 @@
                     </m:r>
                     <m:ctrlPr>
                       <w:rPr>
-                        <w:rFonts w:ascii="Cambria Math" w:eastAsia="Cambria Math" w:hAnsi="Cambria Math" w:cs="Cambria Math"/>
+                        <w:rFonts w:ascii="Cambria Math" w:eastAsia="Cambria Math" w:hAnsi="Cambria Math" w:cs="Times New Roman"/>
+                        <w:i/>
                         <w:iCs/>
                         <w:sz w:val="20"/>
                         <w:szCs w:val="20"/>
@@ -640,11 +573,8 @@
                   </m:e>
                   <m:e>
                     <m:r>
-                      <m:rPr>
-                        <m:sty m:val="p"/>
-                      </m:rPr>
-                      <w:rPr>
-                        <w:rFonts w:ascii="Cambria Math" w:eastAsia="Cambria Math" w:hAnsi="Cambria Math" w:cs="Cambria Math"/>
+                      <w:rPr>
+                        <w:rFonts w:ascii="Cambria Math" w:eastAsia="Cambria Math" w:hAnsi="Cambria Math" w:cs="Times New Roman"/>
                         <w:sz w:val="20"/>
                         <w:szCs w:val="20"/>
                       </w:rPr>
@@ -652,7 +582,8 @@
                     </m:r>
                     <m:ctrlPr>
                       <w:rPr>
-                        <w:rFonts w:ascii="Cambria Math" w:eastAsia="Cambria Math" w:hAnsi="Cambria Math" w:cs="Cambria Math"/>
+                        <w:rFonts w:ascii="Cambria Math" w:eastAsia="Cambria Math" w:hAnsi="Cambria Math" w:cs="Times New Roman"/>
+                        <w:i/>
                         <w:iCs/>
                         <w:sz w:val="20"/>
                         <w:szCs w:val="20"/>
@@ -663,11 +594,8 @@
                 <m:mr>
                   <m:e>
                     <m:r>
-                      <m:rPr>
-                        <m:sty m:val="p"/>
-                      </m:rPr>
-                      <w:rPr>
-                        <w:rFonts w:ascii="Cambria Math" w:eastAsia="Cambria Math" w:hAnsi="Cambria Math" w:cs="Cambria Math"/>
+                      <w:rPr>
+                        <w:rFonts w:ascii="Cambria Math" w:eastAsia="Cambria Math" w:hAnsi="Cambria Math" w:cs="Times New Roman"/>
                         <w:sz w:val="20"/>
                         <w:szCs w:val="20"/>
                       </w:rPr>
@@ -675,7 +603,8 @@
                     </m:r>
                     <m:ctrlPr>
                       <w:rPr>
-                        <w:rFonts w:ascii="Cambria Math" w:eastAsia="Cambria Math" w:hAnsi="Cambria Math" w:cs="Cambria Math"/>
+                        <w:rFonts w:ascii="Cambria Math" w:eastAsia="Cambria Math" w:hAnsi="Cambria Math" w:cs="Times New Roman"/>
+                        <w:i/>
                         <w:iCs/>
                         <w:sz w:val="20"/>
                         <w:szCs w:val="20"/>
@@ -684,11 +613,8 @@
                   </m:e>
                   <m:e>
                     <m:r>
-                      <m:rPr>
-                        <m:sty m:val="p"/>
-                      </m:rPr>
-                      <w:rPr>
-                        <w:rFonts w:ascii="Cambria Math" w:eastAsia="Cambria Math" w:hAnsi="Cambria Math" w:cs="Cambria Math"/>
+                      <w:rPr>
+                        <w:rFonts w:ascii="Cambria Math" w:eastAsia="Cambria Math" w:hAnsi="Cambria Math" w:cs="Times New Roman"/>
                         <w:sz w:val="20"/>
                         <w:szCs w:val="20"/>
                       </w:rPr>
@@ -696,7 +622,8 @@
                     </m:r>
                     <m:ctrlPr>
                       <w:rPr>
-                        <w:rFonts w:ascii="Cambria Math" w:eastAsia="Cambria Math" w:hAnsi="Cambria Math" w:cs="Cambria Math"/>
+                        <w:rFonts w:ascii="Cambria Math" w:eastAsia="Cambria Math" w:hAnsi="Cambria Math" w:cs="Times New Roman"/>
+                        <w:i/>
                         <w:iCs/>
                         <w:sz w:val="20"/>
                         <w:szCs w:val="20"/>
@@ -705,11 +632,8 @@
                   </m:e>
                   <m:e>
                     <m:r>
-                      <m:rPr>
-                        <m:sty m:val="p"/>
-                      </m:rPr>
-                      <w:rPr>
-                        <w:rFonts w:ascii="Cambria Math" w:eastAsia="Cambria Math" w:hAnsi="Cambria Math" w:cs="Cambria Math"/>
+                      <w:rPr>
+                        <w:rFonts w:ascii="Cambria Math" w:eastAsia="Cambria Math" w:hAnsi="Cambria Math" w:cs="Times New Roman"/>
                         <w:sz w:val="20"/>
                         <w:szCs w:val="20"/>
                       </w:rPr>
@@ -717,7 +641,8 @@
                     </m:r>
                     <m:ctrlPr>
                       <w:rPr>
-                        <w:rFonts w:ascii="Cambria Math" w:eastAsia="Cambria Math" w:hAnsi="Cambria Math" w:cs="Cambria Math"/>
+                        <w:rFonts w:ascii="Cambria Math" w:eastAsia="Cambria Math" w:hAnsi="Cambria Math" w:cs="Times New Roman"/>
+                        <w:i/>
                         <w:iCs/>
                         <w:sz w:val="20"/>
                         <w:szCs w:val="20"/>
@@ -726,11 +651,8 @@
                   </m:e>
                   <m:e>
                     <m:r>
-                      <m:rPr>
-                        <m:sty m:val="p"/>
-                      </m:rPr>
-                      <w:rPr>
-                        <w:rFonts w:ascii="Cambria Math" w:eastAsia="Cambria Math" w:hAnsi="Cambria Math" w:cs="Cambria Math"/>
+                      <w:rPr>
+                        <w:rFonts w:ascii="Cambria Math" w:eastAsia="Cambria Math" w:hAnsi="Cambria Math" w:cs="Times New Roman"/>
                         <w:sz w:val="20"/>
                         <w:szCs w:val="20"/>
                       </w:rPr>
@@ -738,7 +660,8 @@
                     </m:r>
                     <m:ctrlPr>
                       <w:rPr>
-                        <w:rFonts w:ascii="Cambria Math" w:eastAsia="Cambria Math" w:hAnsi="Cambria Math" w:cs="Cambria Math"/>
+                        <w:rFonts w:ascii="Cambria Math" w:eastAsia="Cambria Math" w:hAnsi="Cambria Math" w:cs="Times New Roman"/>
+                        <w:i/>
                         <w:iCs/>
                         <w:sz w:val="20"/>
                         <w:szCs w:val="20"/>
@@ -749,11 +672,8 @@
                 <m:mr>
                   <m:e>
                     <m:r>
-                      <m:rPr>
-                        <m:sty m:val="p"/>
-                      </m:rPr>
-                      <w:rPr>
-                        <w:rFonts w:ascii="Cambria Math" w:eastAsia="Cambria Math" w:hAnsi="Cambria Math" w:cs="Cambria Math"/>
+                      <w:rPr>
+                        <w:rFonts w:ascii="Cambria Math" w:eastAsia="Cambria Math" w:hAnsi="Cambria Math" w:cs="Times New Roman"/>
                         <w:sz w:val="20"/>
                         <w:szCs w:val="20"/>
                       </w:rPr>
@@ -761,7 +681,8 @@
                     </m:r>
                     <m:ctrlPr>
                       <w:rPr>
-                        <w:rFonts w:ascii="Cambria Math" w:eastAsia="Cambria Math" w:hAnsi="Cambria Math" w:cs="Cambria Math"/>
+                        <w:rFonts w:ascii="Cambria Math" w:eastAsia="Cambria Math" w:hAnsi="Cambria Math" w:cs="Times New Roman"/>
+                        <w:i/>
                         <w:iCs/>
                         <w:sz w:val="20"/>
                         <w:szCs w:val="20"/>
@@ -770,11 +691,8 @@
                   </m:e>
                   <m:e>
                     <m:r>
-                      <m:rPr>
-                        <m:sty m:val="p"/>
-                      </m:rPr>
-                      <w:rPr>
-                        <w:rFonts w:ascii="Cambria Math" w:eastAsia="Cambria Math" w:hAnsi="Cambria Math" w:cs="Cambria Math"/>
+                      <w:rPr>
+                        <w:rFonts w:ascii="Cambria Math" w:eastAsia="Cambria Math" w:hAnsi="Cambria Math" w:cs="Times New Roman"/>
                         <w:sz w:val="20"/>
                         <w:szCs w:val="20"/>
                       </w:rPr>
@@ -782,7 +700,8 @@
                     </m:r>
                     <m:ctrlPr>
                       <w:rPr>
-                        <w:rFonts w:ascii="Cambria Math" w:eastAsia="Cambria Math" w:hAnsi="Cambria Math" w:cs="Cambria Math"/>
+                        <w:rFonts w:ascii="Cambria Math" w:eastAsia="Cambria Math" w:hAnsi="Cambria Math" w:cs="Times New Roman"/>
+                        <w:i/>
                         <w:iCs/>
                         <w:sz w:val="20"/>
                         <w:szCs w:val="20"/>
@@ -790,105 +709,31 @@
                     </m:ctrlPr>
                   </m:e>
                   <m:e>
-                    <m:f>
-                      <m:fPr>
-                        <m:ctrlPr>
-                          <w:rPr>
-                            <w:rFonts w:ascii="Cambria Math" w:eastAsia="Cambria Math" w:hAnsi="Cambria Math" w:cs="Cambria Math"/>
-                            <w:iCs/>
-                            <w:sz w:val="20"/>
-                            <w:szCs w:val="20"/>
-                          </w:rPr>
-                        </m:ctrlPr>
-                      </m:fPr>
-                      <m:num>
-                        <m:r>
-                          <m:rPr>
-                            <m:sty m:val="p"/>
-                          </m:rPr>
-                          <w:rPr>
-                            <w:rFonts w:ascii="Cambria Math" w:eastAsia="Cambria Math" w:hAnsi="Cambria Math" w:cs="Cambria Math"/>
-                            <w:sz w:val="20"/>
-                            <w:szCs w:val="20"/>
-                          </w:rPr>
-                          <m:t>f</m:t>
-                        </m:r>
-                      </m:num>
-                      <m:den>
-                        <m:r>
-                          <m:rPr>
-                            <m:sty m:val="p"/>
-                          </m:rPr>
-                          <w:rPr>
-                            <w:rFonts w:ascii="Cambria Math" w:eastAsia="Cambria Math" w:hAnsi="Cambria Math" w:cs="Cambria Math"/>
-                            <w:sz w:val="20"/>
-                            <w:szCs w:val="20"/>
-                          </w:rPr>
-                          <m:t>f-n</m:t>
-                        </m:r>
-                      </m:den>
-                    </m:f>
-                  </m:e>
-                  <m:e>
-                    <m:r>
-                      <m:rPr>
-                        <m:sty m:val="p"/>
-                      </m:rPr>
-                      <w:rPr>
-                        <w:rFonts w:ascii="Cambria Math" w:eastAsiaTheme="minorEastAsia" w:hAnsi="Cambria Math"/>
-                        <w:sz w:val="20"/>
-                        <w:szCs w:val="20"/>
-                      </w:rPr>
-                      <m:t>-</m:t>
-                    </m:r>
-                    <m:f>
-                      <m:fPr>
-                        <m:ctrlPr>
-                          <w:rPr>
-                            <w:rFonts w:ascii="Cambria Math" w:eastAsiaTheme="minorEastAsia" w:hAnsi="Cambria Math"/>
-                            <w:iCs/>
-                            <w:sz w:val="20"/>
-                            <w:szCs w:val="20"/>
-                          </w:rPr>
-                        </m:ctrlPr>
-                      </m:fPr>
-                      <m:num>
-                        <m:r>
-                          <m:rPr>
-                            <m:sty m:val="p"/>
-                          </m:rPr>
-                          <w:rPr>
-                            <w:rFonts w:ascii="Cambria Math" w:eastAsiaTheme="minorEastAsia" w:hAnsi="Cambria Math"/>
-                            <w:sz w:val="20"/>
-                            <w:szCs w:val="20"/>
-                          </w:rPr>
-                          <m:t>nf</m:t>
-                        </m:r>
-                      </m:num>
-                      <m:den>
-                        <m:r>
-                          <m:rPr>
-                            <m:sty m:val="p"/>
-                          </m:rPr>
-                          <w:rPr>
-                            <w:rFonts w:ascii="Cambria Math" w:eastAsiaTheme="minorEastAsia" w:hAnsi="Cambria Math"/>
-                            <w:sz w:val="20"/>
-                            <w:szCs w:val="20"/>
-                          </w:rPr>
-                          <m:t>f-n</m:t>
-                        </m:r>
-                      </m:den>
-                    </m:f>
+                    <m:r>
+                      <w:rPr>
+                        <w:rFonts w:ascii="Cambria Math" w:eastAsia="Cambria Math" w:hAnsi="Cambria Math" w:cs="Times New Roman"/>
+                        <w:sz w:val="20"/>
+                        <w:szCs w:val="20"/>
+                      </w:rPr>
+                      <m:t>ε</m:t>
+                    </m:r>
+                  </m:e>
+                  <m:e>
+                    <m:r>
+                      <w:rPr>
+                        <w:rFonts w:ascii="Cambria Math" w:eastAsiaTheme="minorEastAsia" w:hAnsi="Cambria Math" w:cs="Times New Roman"/>
+                        <w:sz w:val="20"/>
+                        <w:szCs w:val="20"/>
+                      </w:rPr>
+                      <m:t>n(1-ε)</m:t>
+                    </m:r>
                   </m:e>
                 </m:mr>
                 <m:mr>
                   <m:e>
                     <m:r>
-                      <m:rPr>
-                        <m:sty m:val="p"/>
-                      </m:rPr>
-                      <w:rPr>
-                        <w:rFonts w:ascii="Cambria Math" w:eastAsiaTheme="minorEastAsia" w:hAnsi="Cambria Math"/>
+                      <w:rPr>
+                        <w:rFonts w:ascii="Cambria Math" w:eastAsiaTheme="minorEastAsia" w:hAnsi="Cambria Math" w:cs="Times New Roman"/>
                         <w:sz w:val="20"/>
                         <w:szCs w:val="20"/>
                       </w:rPr>
@@ -896,7 +741,8 @@
                     </m:r>
                     <m:ctrlPr>
                       <w:rPr>
-                        <w:rFonts w:ascii="Cambria Math" w:eastAsia="Cambria Math" w:hAnsi="Cambria Math" w:cs="Cambria Math"/>
+                        <w:rFonts w:ascii="Cambria Math" w:eastAsia="Cambria Math" w:hAnsi="Cambria Math" w:cs="Times New Roman"/>
+                        <w:i/>
                         <w:iCs/>
                         <w:sz w:val="20"/>
                         <w:szCs w:val="20"/>
@@ -905,11 +751,8 @@
                   </m:e>
                   <m:e>
                     <m:r>
-                      <m:rPr>
-                        <m:sty m:val="p"/>
-                      </m:rPr>
-                      <w:rPr>
-                        <w:rFonts w:ascii="Cambria Math" w:eastAsia="Cambria Math" w:hAnsi="Cambria Math" w:cs="Cambria Math"/>
+                      <w:rPr>
+                        <w:rFonts w:ascii="Cambria Math" w:eastAsia="Cambria Math" w:hAnsi="Cambria Math" w:cs="Times New Roman"/>
                         <w:sz w:val="20"/>
                         <w:szCs w:val="20"/>
                       </w:rPr>
@@ -917,7 +760,8 @@
                     </m:r>
                     <m:ctrlPr>
                       <w:rPr>
-                        <w:rFonts w:ascii="Cambria Math" w:eastAsia="Cambria Math" w:hAnsi="Cambria Math" w:cs="Cambria Math"/>
+                        <w:rFonts w:ascii="Cambria Math" w:eastAsia="Cambria Math" w:hAnsi="Cambria Math" w:cs="Times New Roman"/>
+                        <w:i/>
                         <w:iCs/>
                         <w:sz w:val="20"/>
                         <w:szCs w:val="20"/>
@@ -926,11 +770,8 @@
                   </m:e>
                   <m:e>
                     <m:r>
-                      <m:rPr>
-                        <m:sty m:val="p"/>
-                      </m:rPr>
-                      <w:rPr>
-                        <w:rFonts w:ascii="Cambria Math" w:eastAsia="Cambria Math" w:hAnsi="Cambria Math" w:cs="Cambria Math"/>
+                      <w:rPr>
+                        <w:rFonts w:ascii="Cambria Math" w:eastAsia="Cambria Math" w:hAnsi="Cambria Math" w:cs="Times New Roman"/>
                         <w:sz w:val="20"/>
                         <w:szCs w:val="20"/>
                       </w:rPr>
@@ -939,11 +780,8 @@
                   </m:e>
                   <m:e>
                     <m:r>
-                      <m:rPr>
-                        <m:sty m:val="p"/>
-                      </m:rPr>
-                      <w:rPr>
-                        <w:rFonts w:ascii="Cambria Math" w:eastAsiaTheme="minorEastAsia" w:hAnsi="Cambria Math"/>
+                      <w:rPr>
+                        <w:rFonts w:ascii="Cambria Math" w:eastAsiaTheme="minorEastAsia" w:hAnsi="Cambria Math" w:cs="Times New Roman"/>
                         <w:sz w:val="20"/>
                         <w:szCs w:val="20"/>
                       </w:rPr>
@@ -956,7 +794,7 @@
           </m:d>
           <m:r>
             <w:rPr>
-              <w:rFonts w:ascii="Cambria Math" w:eastAsiaTheme="minorEastAsia" w:hAnsi="Cambria Math"/>
+              <w:rFonts w:ascii="Cambria Math" w:eastAsiaTheme="minorEastAsia" w:hAnsi="Cambria Math" w:cs="Times New Roman"/>
               <w:sz w:val="20"/>
               <w:szCs w:val="20"/>
             </w:rPr>
@@ -968,7 +806,7 @@
               <m:endChr m:val="]"/>
               <m:ctrlPr>
                 <w:rPr>
-                  <w:rFonts w:ascii="Cambria Math" w:eastAsiaTheme="minorEastAsia" w:hAnsi="Cambria Math"/>
+                  <w:rFonts w:ascii="Cambria Math" w:eastAsiaTheme="minorEastAsia" w:hAnsi="Cambria Math" w:cs="Times New Roman"/>
                   <w:iCs/>
                   <w:sz w:val="20"/>
                   <w:szCs w:val="20"/>
@@ -988,7 +826,8 @@
                   </m:mcs>
                   <m:ctrlPr>
                     <w:rPr>
-                      <w:rFonts w:ascii="Cambria Math" w:eastAsiaTheme="minorEastAsia" w:hAnsi="Cambria Math"/>
+                      <w:rFonts w:ascii="Cambria Math" w:eastAsiaTheme="minorEastAsia" w:hAnsi="Cambria Math" w:cs="Times New Roman"/>
+                      <w:i/>
                       <w:iCs/>
                       <w:sz w:val="20"/>
                       <w:szCs w:val="20"/>
@@ -999,26 +838,16 @@
                   <m:e>
                     <m:r>
                       <w:rPr>
-                        <w:rFonts w:ascii="Cambria Math" w:eastAsiaTheme="minorEastAsia" w:hAnsi="Cambria Math"/>
-                        <w:sz w:val="20"/>
-                        <w:szCs w:val="20"/>
-                      </w:rPr>
-                      <m:t>1.73205080756887729353</m:t>
-                    </m:r>
-                    <m:r>
-                      <m:rPr>
-                        <m:sty m:val="p"/>
-                      </m:rPr>
-                      <w:rPr>
-                        <w:rFonts w:ascii="Cambria Math" w:eastAsiaTheme="minorEastAsia" w:hAnsi="Cambria Math"/>
-                        <w:sz w:val="20"/>
-                        <w:szCs w:val="20"/>
-                      </w:rPr>
-                      <m:t>/s</m:t>
+                        <w:rFonts w:ascii="Cambria Math" w:eastAsiaTheme="minorEastAsia" w:hAnsi="Cambria Math" w:cs="Times New Roman"/>
+                        <w:sz w:val="20"/>
+                        <w:szCs w:val="20"/>
+                      </w:rPr>
+                      <m:t>1.73205080756887729353/s</m:t>
                     </m:r>
                     <m:ctrlPr>
                       <w:rPr>
-                        <w:rFonts w:ascii="Cambria Math" w:eastAsia="Cambria Math" w:hAnsi="Cambria Math" w:cs="Cambria Math"/>
+                        <w:rFonts w:ascii="Cambria Math" w:eastAsia="Cambria Math" w:hAnsi="Cambria Math" w:cs="Times New Roman"/>
+                        <w:i/>
                         <w:iCs/>
                         <w:sz w:val="20"/>
                         <w:szCs w:val="20"/>
@@ -1027,11 +856,8 @@
                   </m:e>
                   <m:e>
                     <m:r>
-                      <m:rPr>
-                        <m:sty m:val="p"/>
-                      </m:rPr>
-                      <w:rPr>
-                        <w:rFonts w:ascii="Cambria Math" w:eastAsia="Cambria Math" w:hAnsi="Cambria Math" w:cs="Cambria Math"/>
+                      <w:rPr>
+                        <w:rFonts w:ascii="Cambria Math" w:eastAsia="Cambria Math" w:hAnsi="Cambria Math" w:cs="Times New Roman"/>
                         <w:sz w:val="20"/>
                         <w:szCs w:val="20"/>
                       </w:rPr>
@@ -1039,7 +865,8 @@
                     </m:r>
                     <m:ctrlPr>
                       <w:rPr>
-                        <w:rFonts w:ascii="Cambria Math" w:eastAsia="Cambria Math" w:hAnsi="Cambria Math" w:cs="Cambria Math"/>
+                        <w:rFonts w:ascii="Cambria Math" w:eastAsia="Cambria Math" w:hAnsi="Cambria Math" w:cs="Times New Roman"/>
+                        <w:i/>
                         <w:iCs/>
                         <w:sz w:val="20"/>
                         <w:szCs w:val="20"/>
@@ -1048,11 +875,8 @@
                   </m:e>
                   <m:e>
                     <m:r>
-                      <m:rPr>
-                        <m:sty m:val="p"/>
-                      </m:rPr>
-                      <w:rPr>
-                        <w:rFonts w:ascii="Cambria Math" w:eastAsia="Cambria Math" w:hAnsi="Cambria Math" w:cs="Cambria Math"/>
+                      <w:rPr>
+                        <w:rFonts w:ascii="Cambria Math" w:eastAsia="Cambria Math" w:hAnsi="Cambria Math" w:cs="Times New Roman"/>
                         <w:sz w:val="20"/>
                         <w:szCs w:val="20"/>
                       </w:rPr>
@@ -1060,7 +884,8 @@
                     </m:r>
                     <m:ctrlPr>
                       <w:rPr>
-                        <w:rFonts w:ascii="Cambria Math" w:eastAsia="Cambria Math" w:hAnsi="Cambria Math" w:cs="Cambria Math"/>
+                        <w:rFonts w:ascii="Cambria Math" w:eastAsia="Cambria Math" w:hAnsi="Cambria Math" w:cs="Times New Roman"/>
+                        <w:i/>
                         <w:iCs/>
                         <w:sz w:val="20"/>
                         <w:szCs w:val="20"/>
@@ -1069,11 +894,8 @@
                   </m:e>
                   <m:e>
                     <m:r>
-                      <m:rPr>
-                        <m:sty m:val="p"/>
-                      </m:rPr>
-                      <w:rPr>
-                        <w:rFonts w:ascii="Cambria Math" w:eastAsia="Cambria Math" w:hAnsi="Cambria Math" w:cs="Cambria Math"/>
+                      <w:rPr>
+                        <w:rFonts w:ascii="Cambria Math" w:eastAsia="Cambria Math" w:hAnsi="Cambria Math" w:cs="Times New Roman"/>
                         <w:sz w:val="20"/>
                         <w:szCs w:val="20"/>
                       </w:rPr>
@@ -1081,7 +903,8 @@
                     </m:r>
                     <m:ctrlPr>
                       <w:rPr>
-                        <w:rFonts w:ascii="Cambria Math" w:eastAsia="Cambria Math" w:hAnsi="Cambria Math" w:cs="Cambria Math"/>
+                        <w:rFonts w:ascii="Cambria Math" w:eastAsia="Cambria Math" w:hAnsi="Cambria Math" w:cs="Times New Roman"/>
+                        <w:i/>
                         <w:iCs/>
                         <w:sz w:val="20"/>
                         <w:szCs w:val="20"/>
@@ -1092,11 +915,8 @@
                 <m:mr>
                   <m:e>
                     <m:r>
-                      <m:rPr>
-                        <m:sty m:val="p"/>
-                      </m:rPr>
-                      <w:rPr>
-                        <w:rFonts w:ascii="Cambria Math" w:eastAsia="Cambria Math" w:hAnsi="Cambria Math" w:cs="Cambria Math"/>
+                      <w:rPr>
+                        <w:rFonts w:ascii="Cambria Math" w:eastAsia="Cambria Math" w:hAnsi="Cambria Math" w:cs="Times New Roman"/>
                         <w:sz w:val="20"/>
                         <w:szCs w:val="20"/>
                       </w:rPr>
@@ -1104,7 +924,8 @@
                     </m:r>
                     <m:ctrlPr>
                       <w:rPr>
-                        <w:rFonts w:ascii="Cambria Math" w:eastAsia="Cambria Math" w:hAnsi="Cambria Math" w:cs="Cambria Math"/>
+                        <w:rFonts w:ascii="Cambria Math" w:eastAsia="Cambria Math" w:hAnsi="Cambria Math" w:cs="Times New Roman"/>
+                        <w:i/>
                         <w:iCs/>
                         <w:sz w:val="20"/>
                         <w:szCs w:val="20"/>
@@ -1114,7 +935,7 @@
                   <m:e>
                     <m:r>
                       <w:rPr>
-                        <w:rFonts w:ascii="Cambria Math" w:eastAsiaTheme="minorEastAsia" w:hAnsi="Cambria Math"/>
+                        <w:rFonts w:ascii="Cambria Math" w:eastAsiaTheme="minorEastAsia" w:hAnsi="Cambria Math" w:cs="Times New Roman"/>
                         <w:sz w:val="20"/>
                         <w:szCs w:val="20"/>
                       </w:rPr>
@@ -1122,7 +943,8 @@
                     </m:r>
                     <m:ctrlPr>
                       <w:rPr>
-                        <w:rFonts w:ascii="Cambria Math" w:eastAsia="Cambria Math" w:hAnsi="Cambria Math" w:cs="Cambria Math"/>
+                        <w:rFonts w:ascii="Cambria Math" w:eastAsia="Cambria Math" w:hAnsi="Cambria Math" w:cs="Times New Roman"/>
+                        <w:i/>
                         <w:iCs/>
                         <w:sz w:val="20"/>
                         <w:szCs w:val="20"/>
@@ -1131,11 +953,8 @@
                   </m:e>
                   <m:e>
                     <m:r>
-                      <m:rPr>
-                        <m:sty m:val="p"/>
-                      </m:rPr>
-                      <w:rPr>
-                        <w:rFonts w:ascii="Cambria Math" w:eastAsia="Cambria Math" w:hAnsi="Cambria Math" w:cs="Cambria Math"/>
+                      <w:rPr>
+                        <w:rFonts w:ascii="Cambria Math" w:eastAsia="Cambria Math" w:hAnsi="Cambria Math" w:cs="Times New Roman"/>
                         <w:sz w:val="20"/>
                         <w:szCs w:val="20"/>
                       </w:rPr>
@@ -1143,7 +962,8 @@
                     </m:r>
                     <m:ctrlPr>
                       <w:rPr>
-                        <w:rFonts w:ascii="Cambria Math" w:eastAsia="Cambria Math" w:hAnsi="Cambria Math" w:cs="Cambria Math"/>
+                        <w:rFonts w:ascii="Cambria Math" w:eastAsia="Cambria Math" w:hAnsi="Cambria Math" w:cs="Times New Roman"/>
+                        <w:i/>
                         <w:iCs/>
                         <w:sz w:val="20"/>
                         <w:szCs w:val="20"/>
@@ -1152,11 +972,8 @@
                   </m:e>
                   <m:e>
                     <m:r>
-                      <m:rPr>
-                        <m:sty m:val="p"/>
-                      </m:rPr>
-                      <w:rPr>
-                        <w:rFonts w:ascii="Cambria Math" w:eastAsia="Cambria Math" w:hAnsi="Cambria Math" w:cs="Cambria Math"/>
+                      <w:rPr>
+                        <w:rFonts w:ascii="Cambria Math" w:eastAsia="Cambria Math" w:hAnsi="Cambria Math" w:cs="Times New Roman"/>
                         <w:sz w:val="20"/>
                         <w:szCs w:val="20"/>
                       </w:rPr>
@@ -1164,7 +981,8 @@
                     </m:r>
                     <m:ctrlPr>
                       <w:rPr>
-                        <w:rFonts w:ascii="Cambria Math" w:eastAsia="Cambria Math" w:hAnsi="Cambria Math" w:cs="Cambria Math"/>
+                        <w:rFonts w:ascii="Cambria Math" w:eastAsia="Cambria Math" w:hAnsi="Cambria Math" w:cs="Times New Roman"/>
+                        <w:i/>
                         <w:iCs/>
                         <w:sz w:val="20"/>
                         <w:szCs w:val="20"/>
@@ -1175,11 +993,8 @@
                 <m:mr>
                   <m:e>
                     <m:r>
-                      <m:rPr>
-                        <m:sty m:val="p"/>
-                      </m:rPr>
-                      <w:rPr>
-                        <w:rFonts w:ascii="Cambria Math" w:eastAsia="Cambria Math" w:hAnsi="Cambria Math" w:cs="Cambria Math"/>
+                      <w:rPr>
+                        <w:rFonts w:ascii="Cambria Math" w:eastAsia="Cambria Math" w:hAnsi="Cambria Math" w:cs="Times New Roman"/>
                         <w:sz w:val="20"/>
                         <w:szCs w:val="20"/>
                       </w:rPr>
@@ -1187,7 +1002,8 @@
                     </m:r>
                     <m:ctrlPr>
                       <w:rPr>
-                        <w:rFonts w:ascii="Cambria Math" w:eastAsia="Cambria Math" w:hAnsi="Cambria Math" w:cs="Cambria Math"/>
+                        <w:rFonts w:ascii="Cambria Math" w:eastAsia="Cambria Math" w:hAnsi="Cambria Math" w:cs="Times New Roman"/>
+                        <w:i/>
                         <w:iCs/>
                         <w:sz w:val="20"/>
                         <w:szCs w:val="20"/>
@@ -1196,11 +1012,8 @@
                   </m:e>
                   <m:e>
                     <m:r>
-                      <m:rPr>
-                        <m:sty m:val="p"/>
-                      </m:rPr>
-                      <w:rPr>
-                        <w:rFonts w:ascii="Cambria Math" w:eastAsia="Cambria Math" w:hAnsi="Cambria Math" w:cs="Cambria Math"/>
+                      <w:rPr>
+                        <w:rFonts w:ascii="Cambria Math" w:eastAsia="Cambria Math" w:hAnsi="Cambria Math" w:cs="Times New Roman"/>
                         <w:sz w:val="20"/>
                         <w:szCs w:val="20"/>
                       </w:rPr>
@@ -1208,7 +1021,8 @@
                     </m:r>
                     <m:ctrlPr>
                       <w:rPr>
-                        <w:rFonts w:ascii="Cambria Math" w:eastAsia="Cambria Math" w:hAnsi="Cambria Math" w:cs="Cambria Math"/>
+                        <w:rFonts w:ascii="Cambria Math" w:eastAsia="Cambria Math" w:hAnsi="Cambria Math" w:cs="Times New Roman"/>
+                        <w:i/>
                         <w:iCs/>
                         <w:sz w:val="20"/>
                         <w:szCs w:val="20"/>
@@ -1216,37 +1030,81 @@
                     </m:ctrlPr>
                   </m:e>
                   <m:e>
-                    <m:r>
-                      <w:rPr>
-                        <w:rFonts w:ascii="Cambria Math" w:eastAsia="Cambria Math" w:hAnsi="Cambria Math" w:cs="Cambria Math"/>
-                        <w:sz w:val="20"/>
-                        <w:szCs w:val="20"/>
-                      </w:rPr>
-                      <m:t>1.001001001001001001</m:t>
-                    </m:r>
-                  </m:e>
-                  <m:e>
-                    <m:r>
-                      <m:rPr>
-                        <m:sty m:val="p"/>
-                      </m:rPr>
-                      <w:rPr>
-                        <w:rFonts w:ascii="Cambria Math" w:eastAsiaTheme="minorEastAsia" w:hAnsi="Cambria Math"/>
-                        <w:sz w:val="20"/>
-                        <w:szCs w:val="20"/>
-                      </w:rPr>
-                      <m:t>-0.1001001001001001001</m:t>
-                    </m:r>
+                    <m:sSup>
+                      <m:sSupPr>
+                        <m:ctrlPr>
+                          <w:rPr>
+                            <w:rFonts w:ascii="Cambria Math" w:eastAsia="Cambria Math" w:hAnsi="Cambria Math" w:cs="Times New Roman"/>
+                            <w:i/>
+                            <w:iCs/>
+                            <w:sz w:val="20"/>
+                            <w:szCs w:val="20"/>
+                          </w:rPr>
+                        </m:ctrlPr>
+                      </m:sSupPr>
+                      <m:e>
+                        <m:r>
+                          <w:rPr>
+                            <w:rFonts w:ascii="Cambria Math" w:eastAsia="Cambria Math" w:hAnsi="Cambria Math" w:cs="Times New Roman"/>
+                            <w:sz w:val="20"/>
+                            <w:szCs w:val="20"/>
+                          </w:rPr>
+                          <m:t>2</m:t>
+                        </m:r>
+                      </m:e>
+                      <m:sup>
+                        <m:r>
+                          <w:rPr>
+                            <w:rFonts w:ascii="Cambria Math" w:eastAsia="Cambria Math" w:hAnsi="Cambria Math" w:cs="Times New Roman"/>
+                            <w:sz w:val="20"/>
+                            <w:szCs w:val="20"/>
+                          </w:rPr>
+                          <m:t>-20</m:t>
+                        </m:r>
+                      </m:sup>
+                    </m:sSup>
+                  </m:e>
+                  <m:e>
+                    <m:sSup>
+                      <m:sSupPr>
+                        <m:ctrlPr>
+                          <w:rPr>
+                            <w:rFonts w:ascii="Cambria Math" w:eastAsiaTheme="minorEastAsia" w:hAnsi="Cambria Math" w:cs="Times New Roman"/>
+                            <w:i/>
+                            <w:iCs/>
+                            <w:sz w:val="20"/>
+                            <w:szCs w:val="20"/>
+                          </w:rPr>
+                        </m:ctrlPr>
+                      </m:sSupPr>
+                      <m:e>
+                        <m:r>
+                          <w:rPr>
+                            <w:rFonts w:ascii="Cambria Math" w:eastAsiaTheme="minorEastAsia" w:hAnsi="Cambria Math" w:cs="Times New Roman"/>
+                            <w:sz w:val="20"/>
+                            <w:szCs w:val="20"/>
+                          </w:rPr>
+                          <m:t>10</m:t>
+                        </m:r>
+                      </m:e>
+                      <m:sup>
+                        <m:r>
+                          <w:rPr>
+                            <w:rFonts w:ascii="Cambria Math" w:eastAsiaTheme="minorEastAsia" w:hAnsi="Cambria Math" w:cs="Times New Roman"/>
+                            <w:sz w:val="20"/>
+                            <w:szCs w:val="20"/>
+                          </w:rPr>
+                          <m:t>-2</m:t>
+                        </m:r>
+                      </m:sup>
+                    </m:sSup>
                   </m:e>
                 </m:mr>
                 <m:mr>
                   <m:e>
                     <m:r>
-                      <m:rPr>
-                        <m:sty m:val="p"/>
-                      </m:rPr>
-                      <w:rPr>
-                        <w:rFonts w:ascii="Cambria Math" w:eastAsiaTheme="minorEastAsia" w:hAnsi="Cambria Math"/>
+                      <w:rPr>
+                        <w:rFonts w:ascii="Cambria Math" w:eastAsiaTheme="minorEastAsia" w:hAnsi="Cambria Math" w:cs="Times New Roman"/>
                         <w:sz w:val="20"/>
                         <w:szCs w:val="20"/>
                       </w:rPr>
@@ -1254,7 +1112,8 @@
                     </m:r>
                     <m:ctrlPr>
                       <w:rPr>
-                        <w:rFonts w:ascii="Cambria Math" w:eastAsia="Cambria Math" w:hAnsi="Cambria Math" w:cs="Cambria Math"/>
+                        <w:rFonts w:ascii="Cambria Math" w:eastAsia="Cambria Math" w:hAnsi="Cambria Math" w:cs="Times New Roman"/>
+                        <w:i/>
                         <w:iCs/>
                         <w:sz w:val="20"/>
                         <w:szCs w:val="20"/>
@@ -1263,11 +1122,8 @@
                   </m:e>
                   <m:e>
                     <m:r>
-                      <m:rPr>
-                        <m:sty m:val="p"/>
-                      </m:rPr>
-                      <w:rPr>
-                        <w:rFonts w:ascii="Cambria Math" w:eastAsia="Cambria Math" w:hAnsi="Cambria Math" w:cs="Cambria Math"/>
+                      <w:rPr>
+                        <w:rFonts w:ascii="Cambria Math" w:eastAsia="Cambria Math" w:hAnsi="Cambria Math" w:cs="Times New Roman"/>
                         <w:sz w:val="20"/>
                         <w:szCs w:val="20"/>
                       </w:rPr>
@@ -1275,7 +1131,8 @@
                     </m:r>
                     <m:ctrlPr>
                       <w:rPr>
-                        <w:rFonts w:ascii="Cambria Math" w:eastAsia="Cambria Math" w:hAnsi="Cambria Math" w:cs="Cambria Math"/>
+                        <w:rFonts w:ascii="Cambria Math" w:eastAsia="Cambria Math" w:hAnsi="Cambria Math" w:cs="Times New Roman"/>
+                        <w:i/>
                         <w:iCs/>
                         <w:sz w:val="20"/>
                         <w:szCs w:val="20"/>
@@ -1284,11 +1141,8 @@
                   </m:e>
                   <m:e>
                     <m:r>
-                      <m:rPr>
-                        <m:sty m:val="p"/>
-                      </m:rPr>
-                      <w:rPr>
-                        <w:rFonts w:ascii="Cambria Math" w:eastAsia="Cambria Math" w:hAnsi="Cambria Math" w:cs="Cambria Math"/>
+                      <w:rPr>
+                        <w:rFonts w:ascii="Cambria Math" w:eastAsia="Cambria Math" w:hAnsi="Cambria Math" w:cs="Times New Roman"/>
                         <w:sz w:val="20"/>
                         <w:szCs w:val="20"/>
                       </w:rPr>
@@ -1297,11 +1151,8 @@
                   </m:e>
                   <m:e>
                     <m:r>
-                      <m:rPr>
-                        <m:sty m:val="p"/>
-                      </m:rPr>
-                      <w:rPr>
-                        <w:rFonts w:ascii="Cambria Math" w:eastAsiaTheme="minorEastAsia" w:hAnsi="Cambria Math"/>
+                      <w:rPr>
+                        <w:rFonts w:ascii="Cambria Math" w:eastAsiaTheme="minorEastAsia" w:hAnsi="Cambria Math" w:cs="Times New Roman"/>
                         <w:sz w:val="20"/>
                         <w:szCs w:val="20"/>
                       </w:rPr>
@@ -1312,13 +1163,21 @@
               </m:m>
             </m:e>
           </m:d>
+          <m:r>
+            <w:rPr>
+              <w:rFonts w:ascii="Cambria Math" w:eastAsiaTheme="minorEastAsia" w:hAnsi="Cambria Math" w:cs="Times New Roman"/>
+              <w:sz w:val="20"/>
+              <w:szCs w:val="20"/>
+            </w:rPr>
+            <m:t xml:space="preserve"> </m:t>
+          </m:r>
         </m:oMath>
       </m:oMathPara>
     </w:p>
     <w:p>
       <w:pPr>
         <w:rPr>
-          <w:rFonts w:eastAsiaTheme="minorEastAsia"/>
+          <w:rFonts w:ascii="Cambria" w:eastAsiaTheme="minorEastAsia" w:hAnsi="Cambria" w:cs="Times New Roman"/>
           <w:iCs/>
           <w:sz w:val="20"/>
           <w:szCs w:val="20"/>
@@ -1326,12 +1185,30 @@
       </w:pPr>
       <w:r>
         <w:rPr>
-          <w:rFonts w:eastAsiaTheme="minorEastAsia"/>
+          <w:rFonts w:ascii="Cambria" w:eastAsiaTheme="minorEastAsia" w:hAnsi="Cambria" w:cs="Times New Roman"/>
           <w:iCs/>
           <w:sz w:val="20"/>
           <w:szCs w:val="20"/>
         </w:rPr>
-        <w:t>Where s denotes the aspect ratio.</w:t>
+        <w:t>Where</w:t>
+      </w:r>
+      <w:r>
+        <w:rPr>
+          <w:rFonts w:ascii="Cambria" w:eastAsiaTheme="minorEastAsia" w:hAnsi="Cambria" w:cs="Times New Roman"/>
+          <w:i/>
+          <w:sz w:val="20"/>
+          <w:szCs w:val="20"/>
+        </w:rPr>
+        <w:t xml:space="preserve"> s</w:t>
+      </w:r>
+      <w:r>
+        <w:rPr>
+          <w:rFonts w:ascii="Cambria" w:eastAsiaTheme="minorEastAsia" w:hAnsi="Cambria" w:cs="Times New Roman"/>
+          <w:iCs/>
+          <w:sz w:val="20"/>
+          <w:szCs w:val="20"/>
+        </w:rPr>
+        <w:t xml:space="preserve"> denotes the aspect ratio.</w:t>
       </w:r>
     </w:p>
     <w:sectPr>
@@ -1947,7 +1824,6 @@
   <w:style w:type="character" w:default="1" w:styleId="DefaultParagraphFont">
     <w:name w:val="Default Paragraph Font"/>
     <w:uiPriority w:val="1"/>
-    <w:semiHidden/>
     <w:unhideWhenUsed/>
   </w:style>
   <w:style w:type="table" w:default="1" w:styleId="TableNormal">

</xml_diff>

<commit_message>
Removed reflection, for now. I will add it back later.
</commit_message>
<xml_diff>
--- a/math/projection.docx
+++ b/math/projection.docx
@@ -370,8 +370,37 @@
             <w:rPr>
               <w:rFonts w:ascii="Cambria Math" w:eastAsiaTheme="minorEastAsia" w:hAnsi="Cambria Math" w:cs="Times New Roman"/>
             </w:rPr>
-            <m:t>n=0.1</m:t>
+            <m:t>n=</m:t>
           </m:r>
+          <m:sSub>
+            <m:sSubPr>
+              <m:ctrlPr>
+                <w:rPr>
+                  <w:rFonts w:ascii="Cambria Math" w:eastAsiaTheme="minorEastAsia" w:hAnsi="Cambria Math" w:cs="Times New Roman"/>
+                  <w:i/>
+                </w:rPr>
+              </m:ctrlPr>
+            </m:sSubPr>
+            <m:e>
+              <m:r>
+                <w:rPr>
+                  <w:rFonts w:ascii="Cambria Math" w:eastAsiaTheme="minorEastAsia" w:hAnsi="Cambria Math" w:cs="Times New Roman"/>
+                </w:rPr>
+                <m:t>0.1</m:t>
+              </m:r>
+            </m:e>
+            <m:sub>
+              <m:r>
+                <m:rPr>
+                  <m:sty m:val="p"/>
+                </m:rPr>
+                <w:rPr>
+                  <w:rFonts w:ascii="Cambria Math" w:eastAsiaTheme="minorEastAsia" w:hAnsi="Cambria Math" w:cs="Times New Roman"/>
+                </w:rPr>
+                <m:t>frustum</m:t>
+              </m:r>
+            </m:sub>
+          </m:sSub>
         </m:oMath>
       </m:oMathPara>
     </w:p>
@@ -389,32 +418,55 @@
             </w:rPr>
             <m:t>ε=</m:t>
           </m:r>
-          <m:sSup>
-            <m:sSupPr>
+          <m:sSub>
+            <m:sSubPr>
               <m:ctrlPr>
                 <w:rPr>
                   <w:rFonts w:ascii="Cambria Math" w:eastAsiaTheme="minorEastAsia" w:hAnsi="Cambria Math" w:cs="Times New Roman"/>
                   <w:i/>
                 </w:rPr>
               </m:ctrlPr>
-            </m:sSupPr>
+            </m:sSubPr>
             <m:e>
+              <m:sSup>
+                <m:sSupPr>
+                  <m:ctrlPr>
+                    <w:rPr>
+                      <w:rFonts w:ascii="Cambria Math" w:eastAsiaTheme="minorEastAsia" w:hAnsi="Cambria Math" w:cs="Times New Roman"/>
+                      <w:i/>
+                    </w:rPr>
+                  </m:ctrlPr>
+                </m:sSupPr>
+                <m:e>
+                  <m:r>
+                    <w:rPr>
+                      <w:rFonts w:ascii="Cambria Math" w:eastAsiaTheme="minorEastAsia" w:hAnsi="Cambria Math" w:cs="Times New Roman"/>
+                    </w:rPr>
+                    <m:t>2</m:t>
+                  </m:r>
+                </m:e>
+                <m:sup>
+                  <m:r>
+                    <w:rPr>
+                      <w:rFonts w:ascii="Cambria Math" w:eastAsiaTheme="minorEastAsia" w:hAnsi="Cambria Math" w:cs="Times New Roman"/>
+                    </w:rPr>
+                    <m:t>-20</m:t>
+                  </m:r>
+                </m:sup>
+              </m:sSup>
+            </m:e>
+            <m:sub>
               <m:r>
+                <m:rPr>
+                  <m:sty m:val="p"/>
+                </m:rPr>
                 <w:rPr>
                   <w:rFonts w:ascii="Cambria Math" w:eastAsiaTheme="minorEastAsia" w:hAnsi="Cambria Math" w:cs="Times New Roman"/>
                 </w:rPr>
-                <m:t>2</m:t>
+                <m:t>frustum</m:t>
               </m:r>
-            </m:e>
-            <m:sup>
-              <m:r>
-                <w:rPr>
-                  <w:rFonts w:ascii="Cambria Math" w:eastAsiaTheme="minorEastAsia" w:hAnsi="Cambria Math" w:cs="Times New Roman"/>
-                </w:rPr>
-                <m:t>-20</m:t>
-              </m:r>
-            </m:sup>
-          </m:sSup>
+            </m:sub>
+          </m:sSub>
         </m:oMath>
       </m:oMathPara>
     </w:p>

</xml_diff>

<commit_message>
I'm not inside the cube anymore, but it's still totally messed up.
</commit_message>
<xml_diff>
--- a/math/projection.docx
+++ b/math/projection.docx
@@ -1262,6 +1262,699 @@
         </w:rPr>
         <w:t xml:space="preserve"> denotes the aspect ratio.</w:t>
       </w:r>
+    </w:p>
+    <w:p>
+      <w:pPr>
+        <w:rPr>
+          <w:rFonts w:ascii="Cambria" w:eastAsiaTheme="minorEastAsia" w:hAnsi="Cambria" w:cs="Times New Roman"/>
+          <w:iCs/>
+          <w:sz w:val="20"/>
+          <w:szCs w:val="20"/>
+        </w:rPr>
+      </w:pPr>
+    </w:p>
+    <w:p>
+      <w:pPr>
+        <w:rPr>
+          <w:rFonts w:ascii="Cambria" w:eastAsiaTheme="minorEastAsia" w:hAnsi="Cambria"/>
+        </w:rPr>
+      </w:pPr>
+      <w:r>
+        <w:rPr>
+          <w:rFonts w:ascii="Cambria" w:eastAsiaTheme="minorEastAsia" w:hAnsi="Cambria"/>
+        </w:rPr>
+        <w:t>Taken from Foundations of Game Engine Development Volume 2 page 58.</w:t>
+      </w:r>
+    </w:p>
+    <w:p>
+      <w:pPr>
+        <w:rPr>
+          <w:rFonts w:ascii="Cambria" w:eastAsiaTheme="minorEastAsia" w:hAnsi="Cambria"/>
+        </w:rPr>
+      </w:pPr>
+      <m:oMathPara>
+        <m:oMath>
+          <m:r>
+            <w:rPr>
+              <w:rFonts w:ascii="Cambria Math" w:eastAsiaTheme="minorEastAsia" w:hAnsi="Cambria Math"/>
+            </w:rPr>
+            <m:t>x=</m:t>
+          </m:r>
+          <m:sSub>
+            <m:sSubPr>
+              <m:ctrlPr>
+                <w:rPr>
+                  <w:rFonts w:ascii="Cambria Math" w:eastAsiaTheme="minorEastAsia" w:hAnsi="Cambria Math"/>
+                  <w:i/>
+                </w:rPr>
+              </m:ctrlPr>
+            </m:sSubPr>
+            <m:e>
+              <m:r>
+                <w:rPr>
+                  <w:rFonts w:ascii="Cambria Math" w:eastAsiaTheme="minorEastAsia" w:hAnsi="Cambria Math"/>
+                </w:rPr>
+                <m:t>M</m:t>
+              </m:r>
+            </m:e>
+            <m:sub>
+              <m:r>
+                <w:rPr>
+                  <w:rFonts w:ascii="Cambria Math" w:eastAsiaTheme="minorEastAsia" w:hAnsi="Cambria Math"/>
+                </w:rPr>
+                <m:t>camera[0]</m:t>
+              </m:r>
+            </m:sub>
+          </m:sSub>
+        </m:oMath>
+      </m:oMathPara>
+    </w:p>
+    <w:p>
+      <w:pPr>
+        <w:rPr>
+          <w:rFonts w:ascii="Cambria" w:eastAsiaTheme="minorEastAsia" w:hAnsi="Cambria"/>
+        </w:rPr>
+      </w:pPr>
+      <m:oMathPara>
+        <m:oMath>
+          <m:r>
+            <w:rPr>
+              <w:rFonts w:ascii="Cambria Math" w:eastAsiaTheme="minorEastAsia" w:hAnsi="Cambria Math"/>
+            </w:rPr>
+            <m:t>y</m:t>
+          </m:r>
+          <m:r>
+            <w:rPr>
+              <w:rFonts w:ascii="Cambria Math" w:eastAsiaTheme="minorEastAsia" w:hAnsi="Cambria Math"/>
+            </w:rPr>
+            <m:t>=</m:t>
+          </m:r>
+          <m:sSub>
+            <m:sSubPr>
+              <m:ctrlPr>
+                <w:rPr>
+                  <w:rFonts w:ascii="Cambria Math" w:eastAsiaTheme="minorEastAsia" w:hAnsi="Cambria Math"/>
+                  <w:i/>
+                </w:rPr>
+              </m:ctrlPr>
+            </m:sSubPr>
+            <m:e>
+              <m:r>
+                <w:rPr>
+                  <w:rFonts w:ascii="Cambria Math" w:eastAsiaTheme="minorEastAsia" w:hAnsi="Cambria Math"/>
+                </w:rPr>
+                <m:t>M</m:t>
+              </m:r>
+            </m:e>
+            <m:sub>
+              <m:r>
+                <w:rPr>
+                  <w:rFonts w:ascii="Cambria Math" w:eastAsiaTheme="minorEastAsia" w:hAnsi="Cambria Math"/>
+                </w:rPr>
+                <m:t>camera[</m:t>
+              </m:r>
+              <m:r>
+                <w:rPr>
+                  <w:rFonts w:ascii="Cambria Math" w:eastAsiaTheme="minorEastAsia" w:hAnsi="Cambria Math"/>
+                </w:rPr>
+                <m:t>1</m:t>
+              </m:r>
+              <m:r>
+                <w:rPr>
+                  <w:rFonts w:ascii="Cambria Math" w:eastAsiaTheme="minorEastAsia" w:hAnsi="Cambria Math"/>
+                </w:rPr>
+                <m:t>]</m:t>
+              </m:r>
+            </m:sub>
+          </m:sSub>
+        </m:oMath>
+      </m:oMathPara>
+    </w:p>
+    <w:p>
+      <w:pPr>
+        <w:rPr>
+          <w:rFonts w:ascii="Cambria" w:eastAsiaTheme="minorEastAsia" w:hAnsi="Cambria"/>
+        </w:rPr>
+      </w:pPr>
+      <m:oMathPara>
+        <m:oMath>
+          <m:r>
+            <w:rPr>
+              <w:rFonts w:ascii="Cambria Math" w:eastAsiaTheme="minorEastAsia" w:hAnsi="Cambria Math"/>
+            </w:rPr>
+            <m:t>z</m:t>
+          </m:r>
+          <m:r>
+            <w:rPr>
+              <w:rFonts w:ascii="Cambria Math" w:eastAsiaTheme="minorEastAsia" w:hAnsi="Cambria Math"/>
+            </w:rPr>
+            <m:t>=</m:t>
+          </m:r>
+          <m:sSub>
+            <m:sSubPr>
+              <m:ctrlPr>
+                <w:rPr>
+                  <w:rFonts w:ascii="Cambria Math" w:eastAsiaTheme="minorEastAsia" w:hAnsi="Cambria Math"/>
+                  <w:i/>
+                </w:rPr>
+              </m:ctrlPr>
+            </m:sSubPr>
+            <m:e>
+              <m:r>
+                <w:rPr>
+                  <w:rFonts w:ascii="Cambria Math" w:eastAsiaTheme="minorEastAsia" w:hAnsi="Cambria Math"/>
+                </w:rPr>
+                <m:t>M</m:t>
+              </m:r>
+            </m:e>
+            <m:sub>
+              <m:r>
+                <w:rPr>
+                  <w:rFonts w:ascii="Cambria Math" w:eastAsiaTheme="minorEastAsia" w:hAnsi="Cambria Math"/>
+                </w:rPr>
+                <m:t>camera[</m:t>
+              </m:r>
+              <m:r>
+                <w:rPr>
+                  <w:rFonts w:ascii="Cambria Math" w:eastAsiaTheme="minorEastAsia" w:hAnsi="Cambria Math"/>
+                </w:rPr>
+                <m:t>2</m:t>
+              </m:r>
+              <m:r>
+                <w:rPr>
+                  <w:rFonts w:ascii="Cambria Math" w:eastAsiaTheme="minorEastAsia" w:hAnsi="Cambria Math"/>
+                </w:rPr>
+                <m:t>]</m:t>
+              </m:r>
+            </m:sub>
+          </m:sSub>
+        </m:oMath>
+      </m:oMathPara>
+    </w:p>
+    <w:p>
+      <w:pPr>
+        <w:rPr>
+          <w:rFonts w:ascii="Cambria" w:eastAsiaTheme="minorEastAsia" w:hAnsi="Cambria"/>
+        </w:rPr>
+      </w:pPr>
+      <m:oMathPara>
+        <m:oMath>
+          <m:r>
+            <w:rPr>
+              <w:rFonts w:ascii="Cambria Math" w:eastAsiaTheme="minorEastAsia" w:hAnsi="Cambria Math"/>
+            </w:rPr>
+            <m:t>c</m:t>
+          </m:r>
+          <m:r>
+            <w:rPr>
+              <w:rFonts w:ascii="Cambria Math" w:eastAsiaTheme="minorEastAsia" w:hAnsi="Cambria Math"/>
+            </w:rPr>
+            <m:t>=</m:t>
+          </m:r>
+          <m:sSub>
+            <m:sSubPr>
+              <m:ctrlPr>
+                <w:rPr>
+                  <w:rFonts w:ascii="Cambria Math" w:eastAsiaTheme="minorEastAsia" w:hAnsi="Cambria Math"/>
+                  <w:i/>
+                </w:rPr>
+              </m:ctrlPr>
+            </m:sSubPr>
+            <m:e>
+              <m:r>
+                <w:rPr>
+                  <w:rFonts w:ascii="Cambria Math" w:eastAsiaTheme="minorEastAsia" w:hAnsi="Cambria Math"/>
+                </w:rPr>
+                <m:t>M</m:t>
+              </m:r>
+            </m:e>
+            <m:sub>
+              <m:r>
+                <w:rPr>
+                  <w:rFonts w:ascii="Cambria Math" w:eastAsiaTheme="minorEastAsia" w:hAnsi="Cambria Math"/>
+                </w:rPr>
+                <m:t>camera[</m:t>
+              </m:r>
+              <m:r>
+                <w:rPr>
+                  <w:rFonts w:ascii="Cambria Math" w:eastAsiaTheme="minorEastAsia" w:hAnsi="Cambria Math"/>
+                </w:rPr>
+                <m:t>3</m:t>
+              </m:r>
+              <m:r>
+                <w:rPr>
+                  <w:rFonts w:ascii="Cambria Math" w:eastAsiaTheme="minorEastAsia" w:hAnsi="Cambria Math"/>
+                </w:rPr>
+                <m:t>]</m:t>
+              </m:r>
+            </m:sub>
+          </m:sSub>
+        </m:oMath>
+      </m:oMathPara>
+    </w:p>
+    <w:p>
+      <w:pPr>
+        <w:rPr>
+          <w:rFonts w:ascii="Cambria" w:eastAsiaTheme="minorEastAsia" w:hAnsi="Cambria"/>
+        </w:rPr>
+      </w:pPr>
+      <m:oMathPara>
+        <m:oMath>
+          <m:sSub>
+            <m:sSubPr>
+              <m:ctrlPr>
+                <w:rPr>
+                  <w:rFonts w:ascii="Cambria Math" w:hAnsi="Cambria Math"/>
+                  <w:i/>
+                </w:rPr>
+              </m:ctrlPr>
+            </m:sSubPr>
+            <m:e>
+              <m:r>
+                <w:rPr>
+                  <w:rFonts w:ascii="Cambria Math" w:hAnsi="Cambria Math"/>
+                </w:rPr>
+                <m:t>q</m:t>
+              </m:r>
+            </m:e>
+            <m:sub>
+              <m:r>
+                <w:rPr>
+                  <w:rFonts w:ascii="Cambria Math" w:hAnsi="Cambria Math"/>
+                </w:rPr>
+                <m:t>0</m:t>
+              </m:r>
+            </m:sub>
+          </m:sSub>
+          <m:r>
+            <w:rPr>
+              <w:rFonts w:ascii="Cambria Math" w:hAnsi="Cambria Math"/>
+            </w:rPr>
+            <m:t>=c+</m:t>
+          </m:r>
+          <m:f>
+            <m:fPr>
+              <m:ctrlPr>
+                <w:rPr>
+                  <w:rFonts w:ascii="Cambria Math" w:hAnsi="Cambria Math"/>
+                  <w:i/>
+                </w:rPr>
+              </m:ctrlPr>
+            </m:fPr>
+            <m:num>
+              <m:r>
+                <w:rPr>
+                  <w:rFonts w:ascii="Cambria Math" w:hAnsi="Cambria Math"/>
+                </w:rPr>
+                <m:t>us</m:t>
+              </m:r>
+            </m:num>
+            <m:den>
+              <m:r>
+                <w:rPr>
+                  <w:rFonts w:ascii="Cambria Math" w:hAnsi="Cambria Math"/>
+                </w:rPr>
+                <m:t>g</m:t>
+              </m:r>
+            </m:den>
+          </m:f>
+          <m:r>
+            <w:rPr>
+              <w:rFonts w:ascii="Cambria Math" w:hAnsi="Cambria Math"/>
+            </w:rPr>
+            <m:t>x+</m:t>
+          </m:r>
+          <m:f>
+            <m:fPr>
+              <m:ctrlPr>
+                <w:rPr>
+                  <w:rFonts w:ascii="Cambria Math" w:hAnsi="Cambria Math"/>
+                  <w:i/>
+                </w:rPr>
+              </m:ctrlPr>
+            </m:fPr>
+            <m:num>
+              <m:r>
+                <w:rPr>
+                  <w:rFonts w:ascii="Cambria Math" w:hAnsi="Cambria Math"/>
+                </w:rPr>
+                <m:t>u</m:t>
+              </m:r>
+            </m:num>
+            <m:den>
+              <m:r>
+                <w:rPr>
+                  <w:rFonts w:ascii="Cambria Math" w:hAnsi="Cambria Math"/>
+                </w:rPr>
+                <m:t>g</m:t>
+              </m:r>
+            </m:den>
+          </m:f>
+          <m:r>
+            <w:rPr>
+              <w:rFonts w:ascii="Cambria Math" w:hAnsi="Cambria Math"/>
+            </w:rPr>
+            <m:t>y+uz</m:t>
+          </m:r>
+        </m:oMath>
+      </m:oMathPara>
+    </w:p>
+    <w:p>
+      <w:pPr>
+        <w:rPr>
+          <w:rFonts w:ascii="Cambria" w:hAnsi="Cambria"/>
+        </w:rPr>
+      </w:pPr>
+      <m:oMathPara>
+        <m:oMath>
+          <m:sSub>
+            <m:sSubPr>
+              <m:ctrlPr>
+                <w:rPr>
+                  <w:rFonts w:ascii="Cambria Math" w:hAnsi="Cambria Math"/>
+                  <w:i/>
+                </w:rPr>
+              </m:ctrlPr>
+            </m:sSubPr>
+            <m:e>
+              <m:r>
+                <w:rPr>
+                  <w:rFonts w:ascii="Cambria Math" w:hAnsi="Cambria Math"/>
+                </w:rPr>
+                <m:t>q</m:t>
+              </m:r>
+            </m:e>
+            <m:sub>
+              <m:r>
+                <w:rPr>
+                  <w:rFonts w:ascii="Cambria Math" w:hAnsi="Cambria Math"/>
+                </w:rPr>
+                <m:t>1</m:t>
+              </m:r>
+            </m:sub>
+          </m:sSub>
+          <m:r>
+            <w:rPr>
+              <w:rFonts w:ascii="Cambria Math" w:hAnsi="Cambria Math"/>
+            </w:rPr>
+            <m:t>=c+</m:t>
+          </m:r>
+          <m:f>
+            <m:fPr>
+              <m:ctrlPr>
+                <w:rPr>
+                  <w:rFonts w:ascii="Cambria Math" w:hAnsi="Cambria Math"/>
+                  <w:i/>
+                </w:rPr>
+              </m:ctrlPr>
+            </m:fPr>
+            <m:num>
+              <m:r>
+                <w:rPr>
+                  <w:rFonts w:ascii="Cambria Math" w:hAnsi="Cambria Math"/>
+                </w:rPr>
+                <m:t>us</m:t>
+              </m:r>
+            </m:num>
+            <m:den>
+              <m:r>
+                <w:rPr>
+                  <w:rFonts w:ascii="Cambria Math" w:hAnsi="Cambria Math"/>
+                </w:rPr>
+                <m:t>g</m:t>
+              </m:r>
+            </m:den>
+          </m:f>
+          <m:r>
+            <w:rPr>
+              <w:rFonts w:ascii="Cambria Math" w:hAnsi="Cambria Math"/>
+            </w:rPr>
+            <m:t>x-</m:t>
+          </m:r>
+          <m:f>
+            <m:fPr>
+              <m:ctrlPr>
+                <w:rPr>
+                  <w:rFonts w:ascii="Cambria Math" w:hAnsi="Cambria Math"/>
+                  <w:i/>
+                </w:rPr>
+              </m:ctrlPr>
+            </m:fPr>
+            <m:num>
+              <m:r>
+                <w:rPr>
+                  <w:rFonts w:ascii="Cambria Math" w:hAnsi="Cambria Math"/>
+                </w:rPr>
+                <m:t>u</m:t>
+              </m:r>
+            </m:num>
+            <m:den>
+              <m:r>
+                <w:rPr>
+                  <w:rFonts w:ascii="Cambria Math" w:hAnsi="Cambria Math"/>
+                </w:rPr>
+                <m:t>g</m:t>
+              </m:r>
+            </m:den>
+          </m:f>
+          <m:r>
+            <w:rPr>
+              <w:rFonts w:ascii="Cambria Math" w:hAnsi="Cambria Math"/>
+            </w:rPr>
+            <m:t>y+uz</m:t>
+          </m:r>
+        </m:oMath>
+      </m:oMathPara>
+    </w:p>
+    <w:p>
+      <w:pPr>
+        <w:rPr>
+          <w:rFonts w:ascii="Cambria" w:hAnsi="Cambria"/>
+        </w:rPr>
+      </w:pPr>
+      <m:oMathPara>
+        <m:oMath>
+          <m:sSub>
+            <m:sSubPr>
+              <m:ctrlPr>
+                <w:rPr>
+                  <w:rFonts w:ascii="Cambria Math" w:hAnsi="Cambria Math"/>
+                  <w:i/>
+                </w:rPr>
+              </m:ctrlPr>
+            </m:sSubPr>
+            <m:e>
+              <m:r>
+                <w:rPr>
+                  <w:rFonts w:ascii="Cambria Math" w:hAnsi="Cambria Math"/>
+                </w:rPr>
+                <m:t>q</m:t>
+              </m:r>
+            </m:e>
+            <m:sub>
+              <m:r>
+                <w:rPr>
+                  <w:rFonts w:ascii="Cambria Math" w:hAnsi="Cambria Math"/>
+                </w:rPr>
+                <m:t>2</m:t>
+              </m:r>
+            </m:sub>
+          </m:sSub>
+          <m:r>
+            <w:rPr>
+              <w:rFonts w:ascii="Cambria Math" w:hAnsi="Cambria Math"/>
+            </w:rPr>
+            <m:t>=c-</m:t>
+          </m:r>
+          <m:f>
+            <m:fPr>
+              <m:ctrlPr>
+                <w:rPr>
+                  <w:rFonts w:ascii="Cambria Math" w:hAnsi="Cambria Math"/>
+                  <w:i/>
+                </w:rPr>
+              </m:ctrlPr>
+            </m:fPr>
+            <m:num>
+              <m:r>
+                <w:rPr>
+                  <w:rFonts w:ascii="Cambria Math" w:hAnsi="Cambria Math"/>
+                </w:rPr>
+                <m:t>us</m:t>
+              </m:r>
+            </m:num>
+            <m:den>
+              <m:r>
+                <w:rPr>
+                  <w:rFonts w:ascii="Cambria Math" w:hAnsi="Cambria Math"/>
+                </w:rPr>
+                <m:t>g</m:t>
+              </m:r>
+            </m:den>
+          </m:f>
+          <m:r>
+            <w:rPr>
+              <w:rFonts w:ascii="Cambria Math" w:hAnsi="Cambria Math"/>
+            </w:rPr>
+            <m:t>x</m:t>
+          </m:r>
+          <m:r>
+            <w:rPr>
+              <w:rFonts w:ascii="Cambria Math" w:hAnsi="Cambria Math"/>
+            </w:rPr>
+            <m:t>-</m:t>
+          </m:r>
+          <m:f>
+            <m:fPr>
+              <m:ctrlPr>
+                <w:rPr>
+                  <w:rFonts w:ascii="Cambria Math" w:hAnsi="Cambria Math"/>
+                  <w:i/>
+                </w:rPr>
+              </m:ctrlPr>
+            </m:fPr>
+            <m:num>
+              <m:r>
+                <w:rPr>
+                  <w:rFonts w:ascii="Cambria Math" w:hAnsi="Cambria Math"/>
+                </w:rPr>
+                <m:t>u</m:t>
+              </m:r>
+            </m:num>
+            <m:den>
+              <m:r>
+                <w:rPr>
+                  <w:rFonts w:ascii="Cambria Math" w:hAnsi="Cambria Math"/>
+                </w:rPr>
+                <m:t>g</m:t>
+              </m:r>
+            </m:den>
+          </m:f>
+          <m:r>
+            <w:rPr>
+              <w:rFonts w:ascii="Cambria Math" w:hAnsi="Cambria Math"/>
+            </w:rPr>
+            <m:t>y+uz</m:t>
+          </m:r>
+        </m:oMath>
+      </m:oMathPara>
+    </w:p>
+    <w:p>
+      <w:pPr>
+        <w:rPr>
+          <w:rFonts w:ascii="Cambria" w:hAnsi="Cambria"/>
+        </w:rPr>
+      </w:pPr>
+      <m:oMathPara>
+        <m:oMath>
+          <m:sSub>
+            <m:sSubPr>
+              <m:ctrlPr>
+                <w:rPr>
+                  <w:rFonts w:ascii="Cambria Math" w:hAnsi="Cambria Math"/>
+                  <w:i/>
+                </w:rPr>
+              </m:ctrlPr>
+            </m:sSubPr>
+            <m:e>
+              <m:r>
+                <w:rPr>
+                  <w:rFonts w:ascii="Cambria Math" w:hAnsi="Cambria Math"/>
+                </w:rPr>
+                <m:t>q</m:t>
+              </m:r>
+            </m:e>
+            <m:sub>
+              <m:r>
+                <w:rPr>
+                  <w:rFonts w:ascii="Cambria Math" w:hAnsi="Cambria Math"/>
+                </w:rPr>
+                <m:t>3</m:t>
+              </m:r>
+            </m:sub>
+          </m:sSub>
+          <m:r>
+            <w:rPr>
+              <w:rFonts w:ascii="Cambria Math" w:hAnsi="Cambria Math"/>
+            </w:rPr>
+            <m:t>=c-</m:t>
+          </m:r>
+          <m:f>
+            <m:fPr>
+              <m:ctrlPr>
+                <w:rPr>
+                  <w:rFonts w:ascii="Cambria Math" w:hAnsi="Cambria Math"/>
+                  <w:i/>
+                </w:rPr>
+              </m:ctrlPr>
+            </m:fPr>
+            <m:num>
+              <m:r>
+                <w:rPr>
+                  <w:rFonts w:ascii="Cambria Math" w:hAnsi="Cambria Math"/>
+                </w:rPr>
+                <m:t>us</m:t>
+              </m:r>
+            </m:num>
+            <m:den>
+              <m:r>
+                <w:rPr>
+                  <w:rFonts w:ascii="Cambria Math" w:hAnsi="Cambria Math"/>
+                </w:rPr>
+                <m:t>g</m:t>
+              </m:r>
+            </m:den>
+          </m:f>
+          <m:r>
+            <w:rPr>
+              <w:rFonts w:ascii="Cambria Math" w:hAnsi="Cambria Math"/>
+            </w:rPr>
+            <m:t>x+</m:t>
+          </m:r>
+          <m:f>
+            <m:fPr>
+              <m:ctrlPr>
+                <w:rPr>
+                  <w:rFonts w:ascii="Cambria Math" w:hAnsi="Cambria Math"/>
+                  <w:i/>
+                </w:rPr>
+              </m:ctrlPr>
+            </m:fPr>
+            <m:num>
+              <m:r>
+                <w:rPr>
+                  <w:rFonts w:ascii="Cambria Math" w:hAnsi="Cambria Math"/>
+                </w:rPr>
+                <m:t>u</m:t>
+              </m:r>
+            </m:num>
+            <m:den>
+              <m:r>
+                <w:rPr>
+                  <w:rFonts w:ascii="Cambria Math" w:hAnsi="Cambria Math"/>
+                </w:rPr>
+                <m:t>g</m:t>
+              </m:r>
+            </m:den>
+          </m:f>
+          <m:r>
+            <w:rPr>
+              <w:rFonts w:ascii="Cambria Math" w:hAnsi="Cambria Math"/>
+            </w:rPr>
+            <m:t>y+uz</m:t>
+          </m:r>
+        </m:oMath>
+      </m:oMathPara>
+    </w:p>
+    <w:p>
+      <w:pPr>
+        <w:rPr>
+          <w:rFonts w:ascii="Cambria" w:eastAsiaTheme="minorEastAsia" w:hAnsi="Cambria" w:cs="Times New Roman"/>
+          <w:iCs/>
+          <w:sz w:val="20"/>
+          <w:szCs w:val="20"/>
+        </w:rPr>
+      </w:pPr>
     </w:p>
     <w:sectPr>
       <w:pgSz w:w="12240" w:h="15840"/>

</xml_diff>

<commit_message>
In theory, the camera should work now. In reality, it doesn't, and I'm sure the reason is because I have reversed the z direction.
</commit_message>
<xml_diff>
--- a/math/projection.docx
+++ b/math/projection.docx
@@ -1262,699 +1262,6 @@
         </w:rPr>
         <w:t xml:space="preserve"> denotes the aspect ratio.</w:t>
       </w:r>
-    </w:p>
-    <w:p>
-      <w:pPr>
-        <w:rPr>
-          <w:rFonts w:ascii="Cambria" w:eastAsiaTheme="minorEastAsia" w:hAnsi="Cambria" w:cs="Times New Roman"/>
-          <w:iCs/>
-          <w:sz w:val="20"/>
-          <w:szCs w:val="20"/>
-        </w:rPr>
-      </w:pPr>
-    </w:p>
-    <w:p>
-      <w:pPr>
-        <w:rPr>
-          <w:rFonts w:ascii="Cambria" w:eastAsiaTheme="minorEastAsia" w:hAnsi="Cambria"/>
-        </w:rPr>
-      </w:pPr>
-      <w:r>
-        <w:rPr>
-          <w:rFonts w:ascii="Cambria" w:eastAsiaTheme="minorEastAsia" w:hAnsi="Cambria"/>
-        </w:rPr>
-        <w:t>Taken from Foundations of Game Engine Development Volume 2 page 58.</w:t>
-      </w:r>
-    </w:p>
-    <w:p>
-      <w:pPr>
-        <w:rPr>
-          <w:rFonts w:ascii="Cambria" w:eastAsiaTheme="minorEastAsia" w:hAnsi="Cambria"/>
-        </w:rPr>
-      </w:pPr>
-      <m:oMathPara>
-        <m:oMath>
-          <m:r>
-            <w:rPr>
-              <w:rFonts w:ascii="Cambria Math" w:eastAsiaTheme="minorEastAsia" w:hAnsi="Cambria Math"/>
-            </w:rPr>
-            <m:t>x=</m:t>
-          </m:r>
-          <m:sSub>
-            <m:sSubPr>
-              <m:ctrlPr>
-                <w:rPr>
-                  <w:rFonts w:ascii="Cambria Math" w:eastAsiaTheme="minorEastAsia" w:hAnsi="Cambria Math"/>
-                  <w:i/>
-                </w:rPr>
-              </m:ctrlPr>
-            </m:sSubPr>
-            <m:e>
-              <m:r>
-                <w:rPr>
-                  <w:rFonts w:ascii="Cambria Math" w:eastAsiaTheme="minorEastAsia" w:hAnsi="Cambria Math"/>
-                </w:rPr>
-                <m:t>M</m:t>
-              </m:r>
-            </m:e>
-            <m:sub>
-              <m:r>
-                <w:rPr>
-                  <w:rFonts w:ascii="Cambria Math" w:eastAsiaTheme="minorEastAsia" w:hAnsi="Cambria Math"/>
-                </w:rPr>
-                <m:t>camera[0]</m:t>
-              </m:r>
-            </m:sub>
-          </m:sSub>
-        </m:oMath>
-      </m:oMathPara>
-    </w:p>
-    <w:p>
-      <w:pPr>
-        <w:rPr>
-          <w:rFonts w:ascii="Cambria" w:eastAsiaTheme="minorEastAsia" w:hAnsi="Cambria"/>
-        </w:rPr>
-      </w:pPr>
-      <m:oMathPara>
-        <m:oMath>
-          <m:r>
-            <w:rPr>
-              <w:rFonts w:ascii="Cambria Math" w:eastAsiaTheme="minorEastAsia" w:hAnsi="Cambria Math"/>
-            </w:rPr>
-            <m:t>y</m:t>
-          </m:r>
-          <m:r>
-            <w:rPr>
-              <w:rFonts w:ascii="Cambria Math" w:eastAsiaTheme="minorEastAsia" w:hAnsi="Cambria Math"/>
-            </w:rPr>
-            <m:t>=</m:t>
-          </m:r>
-          <m:sSub>
-            <m:sSubPr>
-              <m:ctrlPr>
-                <w:rPr>
-                  <w:rFonts w:ascii="Cambria Math" w:eastAsiaTheme="minorEastAsia" w:hAnsi="Cambria Math"/>
-                  <w:i/>
-                </w:rPr>
-              </m:ctrlPr>
-            </m:sSubPr>
-            <m:e>
-              <m:r>
-                <w:rPr>
-                  <w:rFonts w:ascii="Cambria Math" w:eastAsiaTheme="minorEastAsia" w:hAnsi="Cambria Math"/>
-                </w:rPr>
-                <m:t>M</m:t>
-              </m:r>
-            </m:e>
-            <m:sub>
-              <m:r>
-                <w:rPr>
-                  <w:rFonts w:ascii="Cambria Math" w:eastAsiaTheme="minorEastAsia" w:hAnsi="Cambria Math"/>
-                </w:rPr>
-                <m:t>camera[</m:t>
-              </m:r>
-              <m:r>
-                <w:rPr>
-                  <w:rFonts w:ascii="Cambria Math" w:eastAsiaTheme="minorEastAsia" w:hAnsi="Cambria Math"/>
-                </w:rPr>
-                <m:t>1</m:t>
-              </m:r>
-              <m:r>
-                <w:rPr>
-                  <w:rFonts w:ascii="Cambria Math" w:eastAsiaTheme="minorEastAsia" w:hAnsi="Cambria Math"/>
-                </w:rPr>
-                <m:t>]</m:t>
-              </m:r>
-            </m:sub>
-          </m:sSub>
-        </m:oMath>
-      </m:oMathPara>
-    </w:p>
-    <w:p>
-      <w:pPr>
-        <w:rPr>
-          <w:rFonts w:ascii="Cambria" w:eastAsiaTheme="minorEastAsia" w:hAnsi="Cambria"/>
-        </w:rPr>
-      </w:pPr>
-      <m:oMathPara>
-        <m:oMath>
-          <m:r>
-            <w:rPr>
-              <w:rFonts w:ascii="Cambria Math" w:eastAsiaTheme="minorEastAsia" w:hAnsi="Cambria Math"/>
-            </w:rPr>
-            <m:t>z</m:t>
-          </m:r>
-          <m:r>
-            <w:rPr>
-              <w:rFonts w:ascii="Cambria Math" w:eastAsiaTheme="minorEastAsia" w:hAnsi="Cambria Math"/>
-            </w:rPr>
-            <m:t>=</m:t>
-          </m:r>
-          <m:sSub>
-            <m:sSubPr>
-              <m:ctrlPr>
-                <w:rPr>
-                  <w:rFonts w:ascii="Cambria Math" w:eastAsiaTheme="minorEastAsia" w:hAnsi="Cambria Math"/>
-                  <w:i/>
-                </w:rPr>
-              </m:ctrlPr>
-            </m:sSubPr>
-            <m:e>
-              <m:r>
-                <w:rPr>
-                  <w:rFonts w:ascii="Cambria Math" w:eastAsiaTheme="minorEastAsia" w:hAnsi="Cambria Math"/>
-                </w:rPr>
-                <m:t>M</m:t>
-              </m:r>
-            </m:e>
-            <m:sub>
-              <m:r>
-                <w:rPr>
-                  <w:rFonts w:ascii="Cambria Math" w:eastAsiaTheme="minorEastAsia" w:hAnsi="Cambria Math"/>
-                </w:rPr>
-                <m:t>camera[</m:t>
-              </m:r>
-              <m:r>
-                <w:rPr>
-                  <w:rFonts w:ascii="Cambria Math" w:eastAsiaTheme="minorEastAsia" w:hAnsi="Cambria Math"/>
-                </w:rPr>
-                <m:t>2</m:t>
-              </m:r>
-              <m:r>
-                <w:rPr>
-                  <w:rFonts w:ascii="Cambria Math" w:eastAsiaTheme="minorEastAsia" w:hAnsi="Cambria Math"/>
-                </w:rPr>
-                <m:t>]</m:t>
-              </m:r>
-            </m:sub>
-          </m:sSub>
-        </m:oMath>
-      </m:oMathPara>
-    </w:p>
-    <w:p>
-      <w:pPr>
-        <w:rPr>
-          <w:rFonts w:ascii="Cambria" w:eastAsiaTheme="minorEastAsia" w:hAnsi="Cambria"/>
-        </w:rPr>
-      </w:pPr>
-      <m:oMathPara>
-        <m:oMath>
-          <m:r>
-            <w:rPr>
-              <w:rFonts w:ascii="Cambria Math" w:eastAsiaTheme="minorEastAsia" w:hAnsi="Cambria Math"/>
-            </w:rPr>
-            <m:t>c</m:t>
-          </m:r>
-          <m:r>
-            <w:rPr>
-              <w:rFonts w:ascii="Cambria Math" w:eastAsiaTheme="minorEastAsia" w:hAnsi="Cambria Math"/>
-            </w:rPr>
-            <m:t>=</m:t>
-          </m:r>
-          <m:sSub>
-            <m:sSubPr>
-              <m:ctrlPr>
-                <w:rPr>
-                  <w:rFonts w:ascii="Cambria Math" w:eastAsiaTheme="minorEastAsia" w:hAnsi="Cambria Math"/>
-                  <w:i/>
-                </w:rPr>
-              </m:ctrlPr>
-            </m:sSubPr>
-            <m:e>
-              <m:r>
-                <w:rPr>
-                  <w:rFonts w:ascii="Cambria Math" w:eastAsiaTheme="minorEastAsia" w:hAnsi="Cambria Math"/>
-                </w:rPr>
-                <m:t>M</m:t>
-              </m:r>
-            </m:e>
-            <m:sub>
-              <m:r>
-                <w:rPr>
-                  <w:rFonts w:ascii="Cambria Math" w:eastAsiaTheme="minorEastAsia" w:hAnsi="Cambria Math"/>
-                </w:rPr>
-                <m:t>camera[</m:t>
-              </m:r>
-              <m:r>
-                <w:rPr>
-                  <w:rFonts w:ascii="Cambria Math" w:eastAsiaTheme="minorEastAsia" w:hAnsi="Cambria Math"/>
-                </w:rPr>
-                <m:t>3</m:t>
-              </m:r>
-              <m:r>
-                <w:rPr>
-                  <w:rFonts w:ascii="Cambria Math" w:eastAsiaTheme="minorEastAsia" w:hAnsi="Cambria Math"/>
-                </w:rPr>
-                <m:t>]</m:t>
-              </m:r>
-            </m:sub>
-          </m:sSub>
-        </m:oMath>
-      </m:oMathPara>
-    </w:p>
-    <w:p>
-      <w:pPr>
-        <w:rPr>
-          <w:rFonts w:ascii="Cambria" w:eastAsiaTheme="minorEastAsia" w:hAnsi="Cambria"/>
-        </w:rPr>
-      </w:pPr>
-      <m:oMathPara>
-        <m:oMath>
-          <m:sSub>
-            <m:sSubPr>
-              <m:ctrlPr>
-                <w:rPr>
-                  <w:rFonts w:ascii="Cambria Math" w:hAnsi="Cambria Math"/>
-                  <w:i/>
-                </w:rPr>
-              </m:ctrlPr>
-            </m:sSubPr>
-            <m:e>
-              <m:r>
-                <w:rPr>
-                  <w:rFonts w:ascii="Cambria Math" w:hAnsi="Cambria Math"/>
-                </w:rPr>
-                <m:t>q</m:t>
-              </m:r>
-            </m:e>
-            <m:sub>
-              <m:r>
-                <w:rPr>
-                  <w:rFonts w:ascii="Cambria Math" w:hAnsi="Cambria Math"/>
-                </w:rPr>
-                <m:t>0</m:t>
-              </m:r>
-            </m:sub>
-          </m:sSub>
-          <m:r>
-            <w:rPr>
-              <w:rFonts w:ascii="Cambria Math" w:hAnsi="Cambria Math"/>
-            </w:rPr>
-            <m:t>=c+</m:t>
-          </m:r>
-          <m:f>
-            <m:fPr>
-              <m:ctrlPr>
-                <w:rPr>
-                  <w:rFonts w:ascii="Cambria Math" w:hAnsi="Cambria Math"/>
-                  <w:i/>
-                </w:rPr>
-              </m:ctrlPr>
-            </m:fPr>
-            <m:num>
-              <m:r>
-                <w:rPr>
-                  <w:rFonts w:ascii="Cambria Math" w:hAnsi="Cambria Math"/>
-                </w:rPr>
-                <m:t>us</m:t>
-              </m:r>
-            </m:num>
-            <m:den>
-              <m:r>
-                <w:rPr>
-                  <w:rFonts w:ascii="Cambria Math" w:hAnsi="Cambria Math"/>
-                </w:rPr>
-                <m:t>g</m:t>
-              </m:r>
-            </m:den>
-          </m:f>
-          <m:r>
-            <w:rPr>
-              <w:rFonts w:ascii="Cambria Math" w:hAnsi="Cambria Math"/>
-            </w:rPr>
-            <m:t>x+</m:t>
-          </m:r>
-          <m:f>
-            <m:fPr>
-              <m:ctrlPr>
-                <w:rPr>
-                  <w:rFonts w:ascii="Cambria Math" w:hAnsi="Cambria Math"/>
-                  <w:i/>
-                </w:rPr>
-              </m:ctrlPr>
-            </m:fPr>
-            <m:num>
-              <m:r>
-                <w:rPr>
-                  <w:rFonts w:ascii="Cambria Math" w:hAnsi="Cambria Math"/>
-                </w:rPr>
-                <m:t>u</m:t>
-              </m:r>
-            </m:num>
-            <m:den>
-              <m:r>
-                <w:rPr>
-                  <w:rFonts w:ascii="Cambria Math" w:hAnsi="Cambria Math"/>
-                </w:rPr>
-                <m:t>g</m:t>
-              </m:r>
-            </m:den>
-          </m:f>
-          <m:r>
-            <w:rPr>
-              <w:rFonts w:ascii="Cambria Math" w:hAnsi="Cambria Math"/>
-            </w:rPr>
-            <m:t>y+uz</m:t>
-          </m:r>
-        </m:oMath>
-      </m:oMathPara>
-    </w:p>
-    <w:p>
-      <w:pPr>
-        <w:rPr>
-          <w:rFonts w:ascii="Cambria" w:hAnsi="Cambria"/>
-        </w:rPr>
-      </w:pPr>
-      <m:oMathPara>
-        <m:oMath>
-          <m:sSub>
-            <m:sSubPr>
-              <m:ctrlPr>
-                <w:rPr>
-                  <w:rFonts w:ascii="Cambria Math" w:hAnsi="Cambria Math"/>
-                  <w:i/>
-                </w:rPr>
-              </m:ctrlPr>
-            </m:sSubPr>
-            <m:e>
-              <m:r>
-                <w:rPr>
-                  <w:rFonts w:ascii="Cambria Math" w:hAnsi="Cambria Math"/>
-                </w:rPr>
-                <m:t>q</m:t>
-              </m:r>
-            </m:e>
-            <m:sub>
-              <m:r>
-                <w:rPr>
-                  <w:rFonts w:ascii="Cambria Math" w:hAnsi="Cambria Math"/>
-                </w:rPr>
-                <m:t>1</m:t>
-              </m:r>
-            </m:sub>
-          </m:sSub>
-          <m:r>
-            <w:rPr>
-              <w:rFonts w:ascii="Cambria Math" w:hAnsi="Cambria Math"/>
-            </w:rPr>
-            <m:t>=c+</m:t>
-          </m:r>
-          <m:f>
-            <m:fPr>
-              <m:ctrlPr>
-                <w:rPr>
-                  <w:rFonts w:ascii="Cambria Math" w:hAnsi="Cambria Math"/>
-                  <w:i/>
-                </w:rPr>
-              </m:ctrlPr>
-            </m:fPr>
-            <m:num>
-              <m:r>
-                <w:rPr>
-                  <w:rFonts w:ascii="Cambria Math" w:hAnsi="Cambria Math"/>
-                </w:rPr>
-                <m:t>us</m:t>
-              </m:r>
-            </m:num>
-            <m:den>
-              <m:r>
-                <w:rPr>
-                  <w:rFonts w:ascii="Cambria Math" w:hAnsi="Cambria Math"/>
-                </w:rPr>
-                <m:t>g</m:t>
-              </m:r>
-            </m:den>
-          </m:f>
-          <m:r>
-            <w:rPr>
-              <w:rFonts w:ascii="Cambria Math" w:hAnsi="Cambria Math"/>
-            </w:rPr>
-            <m:t>x-</m:t>
-          </m:r>
-          <m:f>
-            <m:fPr>
-              <m:ctrlPr>
-                <w:rPr>
-                  <w:rFonts w:ascii="Cambria Math" w:hAnsi="Cambria Math"/>
-                  <w:i/>
-                </w:rPr>
-              </m:ctrlPr>
-            </m:fPr>
-            <m:num>
-              <m:r>
-                <w:rPr>
-                  <w:rFonts w:ascii="Cambria Math" w:hAnsi="Cambria Math"/>
-                </w:rPr>
-                <m:t>u</m:t>
-              </m:r>
-            </m:num>
-            <m:den>
-              <m:r>
-                <w:rPr>
-                  <w:rFonts w:ascii="Cambria Math" w:hAnsi="Cambria Math"/>
-                </w:rPr>
-                <m:t>g</m:t>
-              </m:r>
-            </m:den>
-          </m:f>
-          <m:r>
-            <w:rPr>
-              <w:rFonts w:ascii="Cambria Math" w:hAnsi="Cambria Math"/>
-            </w:rPr>
-            <m:t>y+uz</m:t>
-          </m:r>
-        </m:oMath>
-      </m:oMathPara>
-    </w:p>
-    <w:p>
-      <w:pPr>
-        <w:rPr>
-          <w:rFonts w:ascii="Cambria" w:hAnsi="Cambria"/>
-        </w:rPr>
-      </w:pPr>
-      <m:oMathPara>
-        <m:oMath>
-          <m:sSub>
-            <m:sSubPr>
-              <m:ctrlPr>
-                <w:rPr>
-                  <w:rFonts w:ascii="Cambria Math" w:hAnsi="Cambria Math"/>
-                  <w:i/>
-                </w:rPr>
-              </m:ctrlPr>
-            </m:sSubPr>
-            <m:e>
-              <m:r>
-                <w:rPr>
-                  <w:rFonts w:ascii="Cambria Math" w:hAnsi="Cambria Math"/>
-                </w:rPr>
-                <m:t>q</m:t>
-              </m:r>
-            </m:e>
-            <m:sub>
-              <m:r>
-                <w:rPr>
-                  <w:rFonts w:ascii="Cambria Math" w:hAnsi="Cambria Math"/>
-                </w:rPr>
-                <m:t>2</m:t>
-              </m:r>
-            </m:sub>
-          </m:sSub>
-          <m:r>
-            <w:rPr>
-              <w:rFonts w:ascii="Cambria Math" w:hAnsi="Cambria Math"/>
-            </w:rPr>
-            <m:t>=c-</m:t>
-          </m:r>
-          <m:f>
-            <m:fPr>
-              <m:ctrlPr>
-                <w:rPr>
-                  <w:rFonts w:ascii="Cambria Math" w:hAnsi="Cambria Math"/>
-                  <w:i/>
-                </w:rPr>
-              </m:ctrlPr>
-            </m:fPr>
-            <m:num>
-              <m:r>
-                <w:rPr>
-                  <w:rFonts w:ascii="Cambria Math" w:hAnsi="Cambria Math"/>
-                </w:rPr>
-                <m:t>us</m:t>
-              </m:r>
-            </m:num>
-            <m:den>
-              <m:r>
-                <w:rPr>
-                  <w:rFonts w:ascii="Cambria Math" w:hAnsi="Cambria Math"/>
-                </w:rPr>
-                <m:t>g</m:t>
-              </m:r>
-            </m:den>
-          </m:f>
-          <m:r>
-            <w:rPr>
-              <w:rFonts w:ascii="Cambria Math" w:hAnsi="Cambria Math"/>
-            </w:rPr>
-            <m:t>x</m:t>
-          </m:r>
-          <m:r>
-            <w:rPr>
-              <w:rFonts w:ascii="Cambria Math" w:hAnsi="Cambria Math"/>
-            </w:rPr>
-            <m:t>-</m:t>
-          </m:r>
-          <m:f>
-            <m:fPr>
-              <m:ctrlPr>
-                <w:rPr>
-                  <w:rFonts w:ascii="Cambria Math" w:hAnsi="Cambria Math"/>
-                  <w:i/>
-                </w:rPr>
-              </m:ctrlPr>
-            </m:fPr>
-            <m:num>
-              <m:r>
-                <w:rPr>
-                  <w:rFonts w:ascii="Cambria Math" w:hAnsi="Cambria Math"/>
-                </w:rPr>
-                <m:t>u</m:t>
-              </m:r>
-            </m:num>
-            <m:den>
-              <m:r>
-                <w:rPr>
-                  <w:rFonts w:ascii="Cambria Math" w:hAnsi="Cambria Math"/>
-                </w:rPr>
-                <m:t>g</m:t>
-              </m:r>
-            </m:den>
-          </m:f>
-          <m:r>
-            <w:rPr>
-              <w:rFonts w:ascii="Cambria Math" w:hAnsi="Cambria Math"/>
-            </w:rPr>
-            <m:t>y+uz</m:t>
-          </m:r>
-        </m:oMath>
-      </m:oMathPara>
-    </w:p>
-    <w:p>
-      <w:pPr>
-        <w:rPr>
-          <w:rFonts w:ascii="Cambria" w:hAnsi="Cambria"/>
-        </w:rPr>
-      </w:pPr>
-      <m:oMathPara>
-        <m:oMath>
-          <m:sSub>
-            <m:sSubPr>
-              <m:ctrlPr>
-                <w:rPr>
-                  <w:rFonts w:ascii="Cambria Math" w:hAnsi="Cambria Math"/>
-                  <w:i/>
-                </w:rPr>
-              </m:ctrlPr>
-            </m:sSubPr>
-            <m:e>
-              <m:r>
-                <w:rPr>
-                  <w:rFonts w:ascii="Cambria Math" w:hAnsi="Cambria Math"/>
-                </w:rPr>
-                <m:t>q</m:t>
-              </m:r>
-            </m:e>
-            <m:sub>
-              <m:r>
-                <w:rPr>
-                  <w:rFonts w:ascii="Cambria Math" w:hAnsi="Cambria Math"/>
-                </w:rPr>
-                <m:t>3</m:t>
-              </m:r>
-            </m:sub>
-          </m:sSub>
-          <m:r>
-            <w:rPr>
-              <w:rFonts w:ascii="Cambria Math" w:hAnsi="Cambria Math"/>
-            </w:rPr>
-            <m:t>=c-</m:t>
-          </m:r>
-          <m:f>
-            <m:fPr>
-              <m:ctrlPr>
-                <w:rPr>
-                  <w:rFonts w:ascii="Cambria Math" w:hAnsi="Cambria Math"/>
-                  <w:i/>
-                </w:rPr>
-              </m:ctrlPr>
-            </m:fPr>
-            <m:num>
-              <m:r>
-                <w:rPr>
-                  <w:rFonts w:ascii="Cambria Math" w:hAnsi="Cambria Math"/>
-                </w:rPr>
-                <m:t>us</m:t>
-              </m:r>
-            </m:num>
-            <m:den>
-              <m:r>
-                <w:rPr>
-                  <w:rFonts w:ascii="Cambria Math" w:hAnsi="Cambria Math"/>
-                </w:rPr>
-                <m:t>g</m:t>
-              </m:r>
-            </m:den>
-          </m:f>
-          <m:r>
-            <w:rPr>
-              <w:rFonts w:ascii="Cambria Math" w:hAnsi="Cambria Math"/>
-            </w:rPr>
-            <m:t>x+</m:t>
-          </m:r>
-          <m:f>
-            <m:fPr>
-              <m:ctrlPr>
-                <w:rPr>
-                  <w:rFonts w:ascii="Cambria Math" w:hAnsi="Cambria Math"/>
-                  <w:i/>
-                </w:rPr>
-              </m:ctrlPr>
-            </m:fPr>
-            <m:num>
-              <m:r>
-                <w:rPr>
-                  <w:rFonts w:ascii="Cambria Math" w:hAnsi="Cambria Math"/>
-                </w:rPr>
-                <m:t>u</m:t>
-              </m:r>
-            </m:num>
-            <m:den>
-              <m:r>
-                <w:rPr>
-                  <w:rFonts w:ascii="Cambria Math" w:hAnsi="Cambria Math"/>
-                </w:rPr>
-                <m:t>g</m:t>
-              </m:r>
-            </m:den>
-          </m:f>
-          <m:r>
-            <w:rPr>
-              <w:rFonts w:ascii="Cambria Math" w:hAnsi="Cambria Math"/>
-            </w:rPr>
-            <m:t>y+uz</m:t>
-          </m:r>
-        </m:oMath>
-      </m:oMathPara>
-    </w:p>
-    <w:p>
-      <w:pPr>
-        <w:rPr>
-          <w:rFonts w:ascii="Cambria" w:eastAsiaTheme="minorEastAsia" w:hAnsi="Cambria" w:cs="Times New Roman"/>
-          <w:iCs/>
-          <w:sz w:val="20"/>
-          <w:szCs w:val="20"/>
-        </w:rPr>
-      </w:pPr>
     </w:p>
     <w:sectPr>
       <w:pgSz w:w="12240" w:h="15840"/>

</xml_diff>

<commit_message>
This doesn't seem to really change anything, but I figure that there is so much precision for small floating point values that I might as well anyway.
</commit_message>
<xml_diff>
--- a/math/projection.docx
+++ b/math/projection.docx
@@ -1117,39 +1117,14 @@
                     </m:sSup>
                   </m:e>
                   <m:e>
-                    <m:sSup>
-                      <m:sSupPr>
-                        <m:ctrlPr>
-                          <w:rPr>
-                            <w:rFonts w:ascii="Cambria Math" w:eastAsiaTheme="minorEastAsia" w:hAnsi="Cambria Math" w:cs="Times New Roman"/>
-                            <w:i/>
-                            <w:iCs/>
-                            <w:sz w:val="20"/>
-                            <w:szCs w:val="20"/>
-                          </w:rPr>
-                        </m:ctrlPr>
-                      </m:sSupPr>
-                      <m:e>
-                        <m:r>
-                          <w:rPr>
-                            <w:rFonts w:ascii="Cambria Math" w:eastAsiaTheme="minorEastAsia" w:hAnsi="Cambria Math" w:cs="Times New Roman"/>
-                            <w:sz w:val="20"/>
-                            <w:szCs w:val="20"/>
-                          </w:rPr>
-                          <m:t>10</m:t>
-                        </m:r>
-                      </m:e>
-                      <m:sup>
-                        <m:r>
-                          <w:rPr>
-                            <w:rFonts w:ascii="Cambria Math" w:eastAsiaTheme="minorEastAsia" w:hAnsi="Cambria Math" w:cs="Times New Roman"/>
-                            <w:sz w:val="20"/>
-                            <w:szCs w:val="20"/>
-                          </w:rPr>
-                          <m:t>-2</m:t>
-                        </m:r>
-                      </m:sup>
-                    </m:sSup>
+                    <m:r>
+                      <w:rPr>
+                        <w:rFonts w:ascii="Cambria Math" w:eastAsiaTheme="minorEastAsia" w:hAnsi="Cambria Math" w:cs="Times New Roman"/>
+                        <w:sz w:val="20"/>
+                        <w:szCs w:val="20"/>
+                      </w:rPr>
+                      <m:t>0.09999999999999999998</m:t>
+                    </m:r>
                   </m:e>
                 </m:mr>
                 <m:mr>

</xml_diff>